<commit_message>
TEST - fixing bugs2
</commit_message>
<xml_diff>
--- a/Cambios de valores/List/ROUTER - Implementacion_Regional_a_Seccionales_v2.docx
+++ b/Cambios de valores/List/ROUTER - Implementacion_Regional_a_Seccionales_v2.docx
@@ -73,21 +73,7 @@
           <w:lang w:val="es-419"/>
         </w:rPr>
         <w:br/>
-        <w:t xml:space="preserve">- Mantener </w:t>
-      </w:r>
-      <w:proofErr w:type="spellStart"/>
-      <w:r>
-        <w:rPr>
-          <w:lang w:val="es-419"/>
-        </w:rPr>
-        <w:t>Tabs</w:t>
-      </w:r>
-      <w:proofErr w:type="spellEnd"/>
-      <w:r>
-        <w:rPr>
-          <w:lang w:val="es-419"/>
-        </w:rPr>
-        <w:t xml:space="preserve"> y Clear totalmente funcionales</w:t>
+        <w:t>- Mantener Tabs y Clear totalmente funcionales</w:t>
       </w:r>
     </w:p>
     <w:p>
@@ -154,21 +140,7 @@
           <w:lang w:val="es-419"/>
         </w:rPr>
         <w:br/>
-        <w:t xml:space="preserve">- Lee el parámetro </w:t>
-      </w:r>
-      <w:proofErr w:type="spellStart"/>
-      <w:r>
-        <w:rPr>
-          <w:lang w:val="es-419"/>
-        </w:rPr>
-        <w:t>region</w:t>
-      </w:r>
-      <w:proofErr w:type="spellEnd"/>
-      <w:r>
-        <w:rPr>
-          <w:lang w:val="es-419"/>
-        </w:rPr>
-        <w:t xml:space="preserve"> desde la URL</w:t>
+        <w:t>- Lee el parámetro region desde la URL</w:t>
       </w:r>
       <w:r>
         <w:rPr>
@@ -182,21 +154,7 @@
           <w:lang w:val="es-419"/>
         </w:rPr>
         <w:br/>
-        <w:t xml:space="preserve">- Controla el estado de </w:t>
-      </w:r>
-      <w:proofErr w:type="spellStart"/>
-      <w:r>
-        <w:rPr>
-          <w:lang w:val="es-419"/>
-        </w:rPr>
-        <w:t>Tabs</w:t>
-      </w:r>
-      <w:proofErr w:type="spellEnd"/>
-      <w:r>
-        <w:rPr>
-          <w:lang w:val="es-419"/>
-        </w:rPr>
-        <w:t xml:space="preserve"> y filtros</w:t>
+        <w:t>- Controla el estado de Tabs y filtros</w:t>
       </w:r>
     </w:p>
     <w:p>
@@ -233,21 +191,12 @@
       </w:r>
     </w:p>
     <w:p>
-      <w:proofErr w:type="spellStart"/>
       <w:r>
         <w:rPr>
           <w:rFonts w:ascii="Courier New" w:hAnsi="Courier New"/>
           <w:sz w:val="20"/>
         </w:rPr>
-        <w:t>src</w:t>
-      </w:r>
-      <w:proofErr w:type="spellEnd"/>
-      <w:r>
-        <w:rPr>
-          <w:rFonts w:ascii="Courier New" w:hAnsi="Courier New"/>
-          <w:sz w:val="20"/>
-        </w:rPr>
-        <w:t>/sections/regional/</w:t>
+        <w:t>src/sections/regional/</w:t>
       </w:r>
       <w:r>
         <w:rPr>
@@ -263,44 +212,26 @@
           <w:rFonts w:ascii="Courier New" w:hAnsi="Courier New"/>
           <w:sz w:val="20"/>
         </w:rPr>
-        <w:t>-table-</w:t>
-      </w:r>
-      <w:proofErr w:type="spellStart"/>
+        <w:t>-table-row.jsx</w:t>
+      </w:r>
+    </w:p>
+    <w:p>
+      <w:r>
+        <w:t>3.2 Seccionales – Vista principal</w:t>
+      </w:r>
+    </w:p>
+    <w:p>
+      <w:pPr>
+        <w:rPr>
+          <w:lang w:val="es-419"/>
+        </w:rPr>
+      </w:pPr>
       <w:r>
         <w:rPr>
           <w:rFonts w:ascii="Courier New" w:hAnsi="Courier New"/>
           <w:sz w:val="20"/>
         </w:rPr>
-        <w:t>row.jsx</w:t>
-      </w:r>
-      <w:proofErr w:type="spellEnd"/>
-    </w:p>
-    <w:p>
-      <w:r>
-        <w:t>3.2 Seccionales – Vista principal</w:t>
-      </w:r>
-    </w:p>
-    <w:p>
-      <w:pPr>
-        <w:rPr>
-          <w:lang w:val="es-419"/>
-        </w:rPr>
-      </w:pPr>
-      <w:proofErr w:type="spellStart"/>
-      <w:r>
-        <w:rPr>
-          <w:rFonts w:ascii="Courier New" w:hAnsi="Courier New"/>
-          <w:sz w:val="20"/>
-        </w:rPr>
-        <w:t>src</w:t>
-      </w:r>
-      <w:proofErr w:type="spellEnd"/>
-      <w:r>
-        <w:rPr>
-          <w:rFonts w:ascii="Courier New" w:hAnsi="Courier New"/>
-          <w:sz w:val="20"/>
-        </w:rPr>
-        <w:t>/sections/sectional/view/</w:t>
+        <w:t>src/sections/sectional/view/</w:t>
       </w:r>
       <w:r>
         <w:rPr>
@@ -316,17 +247,8 @@
           <w:rFonts w:ascii="Courier New" w:hAnsi="Courier New"/>
           <w:sz w:val="20"/>
         </w:rPr>
-        <w:t>-list-</w:t>
-      </w:r>
-      <w:proofErr w:type="spellStart"/>
-      <w:r>
-        <w:rPr>
-          <w:rFonts w:ascii="Courier New" w:hAnsi="Courier New"/>
-          <w:sz w:val="20"/>
-        </w:rPr>
-        <w:t>view.jsx</w:t>
-      </w:r>
-      <w:proofErr w:type="spellEnd"/>
+        <w:t>-list-view.jsx</w:t>
+      </w:r>
     </w:p>
     <w:p>
       <w:pPr>
@@ -347,46 +269,95 @@
           <w:lang w:val="es-419"/>
         </w:rPr>
       </w:pPr>
-      <w:proofErr w:type="spellStart"/>
       <w:r>
         <w:rPr>
           <w:rFonts w:ascii="Courier New" w:hAnsi="Courier New"/>
           <w:sz w:val="20"/>
           <w:lang w:val="es-419"/>
         </w:rPr>
-        <w:t>src</w:t>
-      </w:r>
-      <w:proofErr w:type="spellEnd"/>
+        <w:t>src/_mock/_regional.js</w:t>
+      </w:r>
+    </w:p>
+    <w:p>
+      <w:pPr>
+        <w:pStyle w:val="Heading2"/>
+        <w:rPr>
+          <w:lang w:val="es-419"/>
+        </w:rPr>
+      </w:pPr>
+      <w:r>
+        <w:rPr>
+          <w:lang w:val="es-419"/>
+        </w:rPr>
+        <w:t>4. Imports Necesarios (CRÍTICO)</w:t>
+      </w:r>
+    </w:p>
+    <w:p>
+      <w:pPr>
+        <w:rPr>
+          <w:lang w:val="es-419"/>
+        </w:rPr>
+      </w:pPr>
+      <w:r>
+        <w:rPr>
+          <w:lang w:val="es-419"/>
+        </w:rPr>
+        <w:t>4.1 En Regionales</w:t>
+      </w:r>
+    </w:p>
+    <w:p>
+      <w:pPr>
+        <w:rPr>
+          <w:lang w:val="es-419"/>
+        </w:rPr>
+      </w:pPr>
+      <w:r>
+        <w:rPr>
+          <w:lang w:val="es-419"/>
+        </w:rPr>
+        <w:t>Archivo: src/sections/regional/regional-table-row.jsx</w:t>
+      </w:r>
+    </w:p>
+    <w:p>
+      <w:pPr>
+        <w:rPr>
+          <w:lang w:val="es-419"/>
+        </w:rPr>
+      </w:pPr>
+      <w:r>
+        <w:rPr>
+          <w:lang w:val="es-419"/>
+        </w:rPr>
+        <w:t>Asegurarse de tener estos imports:</w:t>
+      </w:r>
+    </w:p>
+    <w:p>
       <w:r>
         <w:rPr>
           <w:rFonts w:ascii="Courier New" w:hAnsi="Courier New"/>
           <w:sz w:val="20"/>
-          <w:lang w:val="es-419"/>
-        </w:rPr>
-        <w:t>/_</w:t>
-      </w:r>
-      <w:proofErr w:type="spellStart"/>
+        </w:rPr>
+        <w:t>import Link from '@mui/material/Link';</w:t>
+      </w:r>
       <w:r>
         <w:rPr>
           <w:rFonts w:ascii="Courier New" w:hAnsi="Courier New"/>
           <w:sz w:val="20"/>
-          <w:lang w:val="es-419"/>
-        </w:rPr>
-        <w:t>mock</w:t>
-      </w:r>
-      <w:proofErr w:type="spellEnd"/>
+        </w:rPr>
+        <w:br/>
+        <w:t>import Box from '@mui/material/Box';</w:t>
+      </w:r>
       <w:r>
         <w:rPr>
           <w:rFonts w:ascii="Courier New" w:hAnsi="Courier New"/>
           <w:sz w:val="20"/>
-          <w:lang w:val="es-419"/>
-        </w:rPr>
-        <w:t>/_regional.js</w:t>
+        </w:rPr>
+        <w:br/>
+        <w:t>import { RouterLink } from 'src/routes/components';</w:t>
       </w:r>
     </w:p>
     <w:p>
       <w:pPr>
-        <w:pStyle w:val="Heading2"/>
         <w:rPr>
           <w:lang w:val="es-419"/>
         </w:rPr>
@@ -395,84 +366,25 @@
         <w:rPr>
           <w:lang w:val="es-419"/>
         </w:rPr>
-        <w:t xml:space="preserve">4. </w:t>
-      </w:r>
-      <w:proofErr w:type="spellStart"/>
+        <w:lastRenderedPageBreak/>
+        <w:t>No se requieren hooks</w:t>
+      </w:r>
       <w:r>
         <w:rPr>
           <w:lang w:val="es-419"/>
         </w:rPr>
-        <w:t>Imports</w:t>
-      </w:r>
-      <w:proofErr w:type="spellEnd"/>
-      <w:r>
-        <w:rPr>
-          <w:lang w:val="es-419"/>
-        </w:rPr>
-        <w:t xml:space="preserve"> Necesarios (CRÍTICO)</w:t>
+        <w:t xml:space="preserve"> adicionales. La lógica se basa únicamente en construir el enlace correctamente.</w:t>
       </w:r>
     </w:p>
     <w:p>
-      <w:pPr>
-        <w:rPr>
-          <w:lang w:val="es-419"/>
-        </w:rPr>
-      </w:pPr>
-      <w:r>
-        <w:rPr>
-          <w:lang w:val="es-419"/>
-        </w:rPr>
-        <w:t>4.1 En Regionales</w:t>
+      <w:r>
+        <w:t>4.2 En Seccionales</w:t>
       </w:r>
     </w:p>
     <w:p>
-      <w:pPr>
-        <w:rPr>
-          <w:lang w:val="es-419"/>
-        </w:rPr>
-      </w:pPr>
-      <w:r>
-        <w:rPr>
-          <w:lang w:val="es-419"/>
-        </w:rPr>
-        <w:t xml:space="preserve">Archivo: </w:t>
-      </w:r>
-      <w:proofErr w:type="spellStart"/>
-      <w:r>
-        <w:rPr>
-          <w:lang w:val="es-419"/>
-        </w:rPr>
-        <w:t>src</w:t>
-      </w:r>
-      <w:proofErr w:type="spellEnd"/>
-      <w:r>
-        <w:rPr>
-          <w:lang w:val="es-419"/>
-        </w:rPr>
-        <w:t>/</w:t>
-      </w:r>
-      <w:proofErr w:type="spellStart"/>
-      <w:r>
-        <w:rPr>
-          <w:lang w:val="es-419"/>
-        </w:rPr>
-        <w:t>sections</w:t>
-      </w:r>
-      <w:proofErr w:type="spellEnd"/>
-      <w:r>
-        <w:rPr>
-          <w:lang w:val="es-419"/>
-        </w:rPr>
-        <w:t>/regional/regional-table-</w:t>
-      </w:r>
-      <w:proofErr w:type="spellStart"/>
-      <w:r>
-        <w:rPr>
-          <w:lang w:val="es-419"/>
-        </w:rPr>
-        <w:t>row.jsx</w:t>
-      </w:r>
-      <w:proofErr w:type="spellEnd"/>
+      <w:r>
+        <w:t>Archivo: src/sections/sectional/view/sectional-list-view.jsx</w:t>
+      </w:r>
     </w:p>
     <w:p>
       <w:pPr>
@@ -484,21 +396,7 @@
         <w:rPr>
           <w:lang w:val="es-419"/>
         </w:rPr>
-        <w:t xml:space="preserve">Asegurarse de tener estos </w:t>
-      </w:r>
-      <w:proofErr w:type="spellStart"/>
-      <w:r>
-        <w:rPr>
-          <w:lang w:val="es-419"/>
-        </w:rPr>
-        <w:t>imports</w:t>
-      </w:r>
-      <w:proofErr w:type="spellEnd"/>
-      <w:r>
-        <w:rPr>
-          <w:lang w:val="es-419"/>
-        </w:rPr>
-        <w:t>:</w:t>
+        <w:t>Agregar o verificar los siguientes imports al inicio del archivo:</w:t>
       </w:r>
     </w:p>
     <w:p>
@@ -507,43 +405,27 @@
           <w:rFonts w:ascii="Courier New" w:hAnsi="Courier New"/>
           <w:sz w:val="20"/>
         </w:rPr>
-        <w:t>import Link from '@</w:t>
-      </w:r>
-      <w:proofErr w:type="spellStart"/>
+        <w:t xml:space="preserve">import { useEffect, useRef } </w:t>
+      </w:r>
       <w:r>
         <w:rPr>
           <w:rFonts w:ascii="Courier New" w:hAnsi="Courier New"/>
           <w:sz w:val="20"/>
         </w:rPr>
-        <w:t>mui</w:t>
-      </w:r>
-      <w:proofErr w:type="spellEnd"/>
+        <w:t>from 'react';</w:t>
+      </w:r>
       <w:r>
         <w:rPr>
           <w:rFonts w:ascii="Courier New" w:hAnsi="Courier New"/>
           <w:sz w:val="20"/>
         </w:rPr>
-        <w:t>/material/Link';</w:t>
-      </w:r>
-      <w:r>
-        <w:rPr>
-          <w:rFonts w:ascii="Courier New" w:hAnsi="Courier New"/>
-          <w:sz w:val="20"/>
-        </w:rPr>
         <w:br/>
-        <w:t>import Box from '@mui/material/Box';</w:t>
-      </w:r>
-      <w:r>
-        <w:rPr>
-          <w:rFonts w:ascii="Courier New" w:hAnsi="Courier New"/>
-          <w:sz w:val="20"/>
-        </w:rPr>
-        <w:br/>
-        <w:t>import { RouterLink } from 'src/routes/components';</w:t>
+        <w:t>import { useSearchParams } from 'next/navigation';</w:t>
       </w:r>
     </w:p>
     <w:p>
       <w:pPr>
+        <w:pStyle w:val="Heading2"/>
         <w:rPr>
           <w:lang w:val="es-419"/>
         </w:rPr>
@@ -552,45 +434,33 @@
         <w:rPr>
           <w:lang w:val="es-419"/>
         </w:rPr>
-        <w:lastRenderedPageBreak/>
-        <w:t xml:space="preserve">No se requieren </w:t>
-      </w:r>
-      <w:proofErr w:type="spellStart"/>
-      <w:r>
-        <w:rPr>
-          <w:lang w:val="es-419"/>
-        </w:rPr>
-        <w:t>hooks</w:t>
-      </w:r>
-      <w:proofErr w:type="spellEnd"/>
-      <w:r>
-        <w:rPr>
-          <w:lang w:val="es-419"/>
-        </w:rPr>
-        <w:t xml:space="preserve"> adicionales. La lógica se basa únicamente en construir el enlace correctamente.</w:t>
+        <w:t>5. Identificación Correcta de Columnas</w:t>
       </w:r>
     </w:p>
     <w:p>
-      <w:r>
-        <w:t xml:space="preserve">4.2 </w:t>
-      </w:r>
-      <w:proofErr w:type="spellStart"/>
-      <w:r>
-        <w:t>En</w:t>
-      </w:r>
-      <w:proofErr w:type="spellEnd"/>
-      <w:r>
-        <w:t xml:space="preserve"> </w:t>
-      </w:r>
-      <w:proofErr w:type="spellStart"/>
-      <w:r>
-        <w:t>Seccionales</w:t>
-      </w:r>
-      <w:proofErr w:type="spellEnd"/>
+      <w:pPr>
+        <w:rPr>
+          <w:lang w:val="es-419"/>
+        </w:rPr>
+      </w:pPr>
+      <w:r>
+        <w:rPr>
+          <w:lang w:val="es-419"/>
+        </w:rPr>
+        <w:t>Nunca usar textos visuales para lógica. Siempre usar el valor canónico del dato.</w:t>
+      </w:r>
     </w:p>
     <w:p>
-      <w:r>
-        <w:t>Archivo: src/sections/sectional/view/sectional-list-view.jsx</w:t>
+      <w:pPr>
+        <w:rPr>
+          <w:lang w:val="es-419"/>
+        </w:rPr>
+      </w:pPr>
+      <w:r>
+        <w:rPr>
+          <w:lang w:val="es-419"/>
+        </w:rPr>
+        <w:t>En Regionales:</w:t>
       </w:r>
     </w:p>
     <w:p>
@@ -603,82 +473,43 @@
         <w:rPr>
           <w:lang w:val="es-419"/>
         </w:rPr>
-        <w:t xml:space="preserve">Agregar o verificar los siguientes </w:t>
-      </w:r>
-      <w:proofErr w:type="spellStart"/>
+        <w:t>- row.regionalFullName → valor usado para filtros y URL</w:t>
+      </w:r>
       <w:r>
         <w:rPr>
           <w:lang w:val="es-419"/>
         </w:rPr>
-        <w:t>imports</w:t>
-      </w:r>
-      <w:proofErr w:type="spellEnd"/>
+        <w:br/>
+      </w:r>
       <w:r>
         <w:rPr>
           <w:lang w:val="es-419"/>
         </w:rPr>
-        <w:t xml:space="preserve"> al inicio del archivo:</w:t>
+        <w:t>- row.regionalName → solo visual</w:t>
+      </w:r>
+      <w:r>
+        <w:rPr>
+          <w:lang w:val="es-419"/>
+        </w:rPr>
+        <w:br/>
+        <w:t>- row.regionalXSectionalCount → valor clickeable</w:t>
       </w:r>
     </w:p>
     <w:p>
-      <w:r>
-        <w:rPr>
-          <w:rFonts w:ascii="Courier New" w:hAnsi="Courier New"/>
-          <w:sz w:val="20"/>
-        </w:rPr>
-        <w:t xml:space="preserve">import { </w:t>
-      </w:r>
-      <w:proofErr w:type="spellStart"/>
-      <w:r>
-        <w:rPr>
-          <w:rFonts w:ascii="Courier New" w:hAnsi="Courier New"/>
-          <w:sz w:val="20"/>
-        </w:rPr>
-        <w:t>useEffect</w:t>
-      </w:r>
-      <w:proofErr w:type="spellEnd"/>
-      <w:r>
-        <w:rPr>
-          <w:rFonts w:ascii="Courier New" w:hAnsi="Courier New"/>
-          <w:sz w:val="20"/>
-        </w:rPr>
-        <w:t xml:space="preserve">, </w:t>
-      </w:r>
-      <w:proofErr w:type="spellStart"/>
-      <w:r>
-        <w:rPr>
-          <w:rFonts w:ascii="Courier New" w:hAnsi="Courier New"/>
-          <w:sz w:val="20"/>
-        </w:rPr>
-        <w:t>useRef</w:t>
-      </w:r>
-      <w:proofErr w:type="spellEnd"/>
-      <w:r>
-        <w:rPr>
-          <w:rFonts w:ascii="Courier New" w:hAnsi="Courier New"/>
-          <w:sz w:val="20"/>
-        </w:rPr>
-        <w:t xml:space="preserve"> } </w:t>
-      </w:r>
-      <w:r>
-        <w:rPr>
-          <w:rFonts w:ascii="Courier New" w:hAnsi="Courier New"/>
-          <w:sz w:val="20"/>
-        </w:rPr>
-        <w:t>from 'react';</w:t>
-      </w:r>
-      <w:r>
-        <w:rPr>
-          <w:rFonts w:ascii="Courier New" w:hAnsi="Courier New"/>
-          <w:sz w:val="20"/>
-        </w:rPr>
-        <w:br/>
-        <w:t>import { useSearchParams } from 'next/navigation';</w:t>
+      <w:pPr>
+        <w:rPr>
+          <w:lang w:val="es-419"/>
+        </w:rPr>
+      </w:pPr>
+      <w:r>
+        <w:rPr>
+          <w:lang w:val="es-419"/>
+        </w:rPr>
+        <w:t>En Seccionales:</w:t>
       </w:r>
     </w:p>
     <w:p>
       <w:pPr>
-        <w:pStyle w:val="Heading2"/>
         <w:rPr>
           <w:lang w:val="es-419"/>
         </w:rPr>
@@ -687,11 +518,19 @@
         <w:rPr>
           <w:lang w:val="es-419"/>
         </w:rPr>
-        <w:t>5. Identificación Correcta de Columnas</w:t>
+        <w:t>- sectional.regionalFullName → valor filtrado</w:t>
+      </w:r>
+      <w:r>
+        <w:rPr>
+          <w:lang w:val="es-419"/>
+        </w:rPr>
+        <w:br/>
+        <w:t>- REGIONAL_FULL_NAME_OPTIONS → fuente única de verdad</w:t>
       </w:r>
     </w:p>
     <w:p>
       <w:pPr>
+        <w:pStyle w:val="Heading2"/>
         <w:rPr>
           <w:lang w:val="es-419"/>
         </w:rPr>
@@ -700,7 +539,7 @@
         <w:rPr>
           <w:lang w:val="es-419"/>
         </w:rPr>
-        <w:t>Nunca usar textos visuales para lógica. Siempre usar el valor canónico del dato.</w:t>
+        <w:t>6. Implementación en Regionales</w:t>
       </w:r>
     </w:p>
     <w:p>
@@ -713,200 +552,14 @@
         <w:rPr>
           <w:lang w:val="es-419"/>
         </w:rPr>
-        <w:t>En Regionales:</w:t>
-      </w:r>
-    </w:p>
-    <w:p>
-      <w:pPr>
+        <w:t xml:space="preserve">Archivo: </w:t>
+      </w:r>
+      <w:r>
         <w:rPr>
           <w:lang w:val="es-419"/>
         </w:rPr>
-      </w:pPr>
-      <w:r>
-        <w:rPr>
-          <w:lang w:val="es-419"/>
-        </w:rPr>
-        <w:t xml:space="preserve">- </w:t>
-      </w:r>
-      <w:proofErr w:type="spellStart"/>
-      <w:r>
-        <w:rPr>
-          <w:lang w:val="es-419"/>
-        </w:rPr>
-        <w:t>row.regionalFullName</w:t>
-      </w:r>
-      <w:proofErr w:type="spellEnd"/>
-      <w:r>
-        <w:rPr>
-          <w:lang w:val="es-419"/>
-        </w:rPr>
-        <w:t xml:space="preserve"> → valor usado para filtros y URL</w:t>
-      </w:r>
-      <w:r>
-        <w:rPr>
-          <w:lang w:val="es-419"/>
-        </w:rPr>
-        <w:br/>
-      </w:r>
-      <w:r>
-        <w:rPr>
-          <w:lang w:val="es-419"/>
-        </w:rPr>
-        <w:t xml:space="preserve">- </w:t>
-      </w:r>
-      <w:proofErr w:type="spellStart"/>
-      <w:r>
-        <w:rPr>
-          <w:lang w:val="es-419"/>
-        </w:rPr>
-        <w:t>row.regionalName</w:t>
-      </w:r>
-      <w:proofErr w:type="spellEnd"/>
-      <w:r>
-        <w:rPr>
-          <w:lang w:val="es-419"/>
-        </w:rPr>
-        <w:t xml:space="preserve"> → solo visual</w:t>
-      </w:r>
-      <w:r>
-        <w:rPr>
-          <w:lang w:val="es-419"/>
-        </w:rPr>
-        <w:br/>
-        <w:t xml:space="preserve">- </w:t>
-      </w:r>
-      <w:proofErr w:type="spellStart"/>
-      <w:r>
-        <w:rPr>
-          <w:lang w:val="es-419"/>
-        </w:rPr>
-        <w:t>row.regionalXSectionalCount</w:t>
-      </w:r>
-      <w:proofErr w:type="spellEnd"/>
-      <w:r>
-        <w:rPr>
-          <w:lang w:val="es-419"/>
-        </w:rPr>
-        <w:t xml:space="preserve"> → valor </w:t>
-      </w:r>
-      <w:proofErr w:type="spellStart"/>
-      <w:r>
-        <w:rPr>
-          <w:lang w:val="es-419"/>
-        </w:rPr>
-        <w:t>clickeable</w:t>
-      </w:r>
-      <w:proofErr w:type="spellEnd"/>
-    </w:p>
-    <w:p>
-      <w:pPr>
-        <w:rPr>
-          <w:lang w:val="es-419"/>
-        </w:rPr>
-      </w:pPr>
-      <w:r>
-        <w:rPr>
-          <w:lang w:val="es-419"/>
-        </w:rPr>
-        <w:t>En Seccionales:</w:t>
-      </w:r>
-    </w:p>
-    <w:p>
-      <w:pPr>
-        <w:rPr>
-          <w:lang w:val="es-419"/>
-        </w:rPr>
-      </w:pPr>
-      <w:r>
-        <w:rPr>
-          <w:lang w:val="es-419"/>
-        </w:rPr>
-        <w:t xml:space="preserve">- </w:t>
-      </w:r>
-      <w:proofErr w:type="spellStart"/>
-      <w:r>
-        <w:rPr>
-          <w:lang w:val="es-419"/>
-        </w:rPr>
-        <w:t>sectional.regionalFullName</w:t>
-      </w:r>
-      <w:proofErr w:type="spellEnd"/>
-      <w:r>
-        <w:rPr>
-          <w:lang w:val="es-419"/>
-        </w:rPr>
-        <w:t xml:space="preserve"> → valor filtrado</w:t>
-      </w:r>
-      <w:r>
-        <w:rPr>
-          <w:lang w:val="es-419"/>
-        </w:rPr>
-        <w:br/>
-        <w:t>- REGIONAL_FULL_NAME_OPTIONS → fuente única de verdad</w:t>
-      </w:r>
-    </w:p>
-    <w:p>
-      <w:pPr>
-        <w:pStyle w:val="Heading2"/>
-        <w:rPr>
-          <w:lang w:val="es-419"/>
-        </w:rPr>
-      </w:pPr>
-      <w:r>
-        <w:rPr>
-          <w:lang w:val="es-419"/>
-        </w:rPr>
-        <w:t>6. Implementación en Regionales</w:t>
-      </w:r>
-    </w:p>
-    <w:p>
-      <w:pPr>
-        <w:rPr>
-          <w:lang w:val="es-419"/>
-        </w:rPr>
-      </w:pPr>
-      <w:r>
-        <w:rPr>
-          <w:lang w:val="es-419"/>
-        </w:rPr>
-        <w:t xml:space="preserve">Archivo: </w:t>
-      </w:r>
-      <w:proofErr w:type="spellStart"/>
-      <w:r>
-        <w:rPr>
-          <w:lang w:val="es-419"/>
-        </w:rPr>
-        <w:t>src</w:t>
-      </w:r>
-      <w:proofErr w:type="spellEnd"/>
-      <w:r>
-        <w:rPr>
-          <w:lang w:val="es-419"/>
-        </w:rPr>
-        <w:t>/</w:t>
-      </w:r>
-      <w:proofErr w:type="spellStart"/>
-      <w:r>
-        <w:rPr>
-          <w:lang w:val="es-419"/>
-        </w:rPr>
-        <w:t>sections</w:t>
-      </w:r>
-      <w:proofErr w:type="spellEnd"/>
-      <w:r>
-        <w:rPr>
-          <w:lang w:val="es-419"/>
-        </w:rPr>
-        <w:t>/regional/regional-table-</w:t>
-      </w:r>
-      <w:proofErr w:type="spellStart"/>
-      <w:r>
-        <w:rPr>
-          <w:lang w:val="es-419"/>
-        </w:rPr>
-        <w:t>row.jsx</w:t>
-      </w:r>
-      <w:proofErr w:type="spellEnd"/>
+        <w:t>src/sections/regional/regional-table-row.jsx</w:t>
+      </w:r>
     </w:p>
     <w:p>
       <w:pPr>
@@ -943,7 +596,6 @@
         </w:rPr>
         <w:t>&lt;</w:t>
       </w:r>
-      <w:proofErr w:type="spellStart"/>
       <w:r>
         <w:rPr>
           <w:rFonts w:ascii="Consolas" w:eastAsia="Times New Roman" w:hAnsi="Consolas" w:cs="Times New Roman"/>
@@ -954,7 +606,6 @@
         </w:rPr>
         <w:t>TableCell</w:t>
       </w:r>
-      <w:proofErr w:type="spellEnd"/>
       <w:r>
         <w:rPr>
           <w:rFonts w:ascii="Consolas" w:eastAsia="Times New Roman" w:hAnsi="Consolas" w:cs="Times New Roman"/>
@@ -1008,7 +659,6 @@
         </w:rPr>
         <w:t xml:space="preserve">Box </w:t>
       </w:r>
-      <w:proofErr w:type="spellStart"/>
       <w:r>
         <w:rPr>
           <w:rFonts w:ascii="Consolas" w:eastAsia="Times New Roman" w:hAnsi="Consolas" w:cs="Times New Roman"/>
@@ -1019,7 +669,6 @@
         </w:rPr>
         <w:t>sx</w:t>
       </w:r>
-      <w:proofErr w:type="spellEnd"/>
       <w:r>
         <w:rPr>
           <w:rFonts w:ascii="Consolas" w:eastAsia="Times New Roman" w:hAnsi="Consolas" w:cs="Times New Roman"/>
@@ -1190,7 +839,6 @@
         </w:rPr>
         <w:t xml:space="preserve"> </w:t>
       </w:r>
-      <w:proofErr w:type="spellStart"/>
       <w:r>
         <w:rPr>
           <w:rFonts w:ascii="Consolas" w:eastAsia="Times New Roman" w:hAnsi="Consolas" w:cs="Times New Roman"/>
@@ -1201,7 +849,6 @@
         </w:rPr>
         <w:t>alignItems</w:t>
       </w:r>
-      <w:proofErr w:type="spellEnd"/>
       <w:r>
         <w:rPr>
           <w:rFonts w:ascii="Consolas" w:eastAsia="Times New Roman" w:hAnsi="Consolas" w:cs="Times New Roman"/>
@@ -1388,7 +1035,6 @@
         </w:rPr>
         <w:t>{</w:t>
       </w:r>
-      <w:proofErr w:type="spellStart"/>
       <w:r>
         <w:rPr>
           <w:rFonts w:ascii="Consolas" w:eastAsia="Times New Roman" w:hAnsi="Consolas" w:cs="Times New Roman"/>
@@ -1399,7 +1045,6 @@
         </w:rPr>
         <w:t>RouterLink</w:t>
       </w:r>
-      <w:proofErr w:type="spellEnd"/>
       <w:r>
         <w:rPr>
           <w:rFonts w:ascii="Consolas" w:eastAsia="Times New Roman" w:hAnsi="Consolas" w:cs="Times New Roman"/>
@@ -1712,7 +1357,6 @@
         </w:rPr>
         <w:t>{</w:t>
       </w:r>
-      <w:proofErr w:type="spellStart"/>
       <w:r>
         <w:rPr>
           <w:rFonts w:ascii="Consolas" w:eastAsia="Times New Roman" w:hAnsi="Consolas" w:cs="Times New Roman"/>
@@ -1741,18 +1385,7 @@
           <w:szCs w:val="16"/>
           <w:lang w:eastAsia="es-419"/>
         </w:rPr>
-        <w:t>regionalXSectionalMemberCount</w:t>
-      </w:r>
-      <w:proofErr w:type="spellEnd"/>
-      <w:r>
-        <w:rPr>
-          <w:rFonts w:ascii="Consolas" w:eastAsia="Times New Roman" w:hAnsi="Consolas" w:cs="Times New Roman"/>
-          <w:color w:val="7DCFFF"/>
-          <w:sz w:val="16"/>
-          <w:szCs w:val="16"/>
-          <w:lang w:eastAsia="es-419"/>
-        </w:rPr>
-        <w:t>}</w:t>
+        <w:t>regionalXSectionalMemberCount}</w:t>
       </w:r>
     </w:p>
     <w:p>
@@ -1883,7 +1516,6 @@
         </w:rPr>
         <w:t>&lt;/</w:t>
       </w:r>
-      <w:proofErr w:type="spellStart"/>
       <w:r>
         <w:rPr>
           <w:rFonts w:ascii="Consolas" w:eastAsia="Times New Roman" w:hAnsi="Consolas" w:cs="Times New Roman"/>
@@ -1894,7 +1526,6 @@
         </w:rPr>
         <w:t>TableCell</w:t>
       </w:r>
-      <w:proofErr w:type="spellEnd"/>
       <w:r>
         <w:rPr>
           <w:rFonts w:ascii="Consolas" w:eastAsia="Times New Roman" w:hAnsi="Consolas" w:cs="Times New Roman"/>
@@ -1919,7 +1550,6 @@
           <w:lang w:val="es-419"/>
         </w:rPr>
       </w:pPr>
-      <w:proofErr w:type="spellStart"/>
       <w:r>
         <w:rPr>
           <w:lang w:val="es-419"/>
@@ -1930,14 +1560,7 @@
         <w:rPr>
           <w:lang w:val="es-419"/>
         </w:rPr>
-        <w:t>ncodeURIComponent</w:t>
-      </w:r>
-      <w:proofErr w:type="spellEnd"/>
-      <w:r>
-        <w:rPr>
-          <w:lang w:val="es-419"/>
-        </w:rPr>
-        <w:t xml:space="preserve"> es obligatorio para manejar espacios y acentos.</w:t>
+        <w:t>ncodeURIComponent es obligatorio para manejar espacios y acentos.</w:t>
       </w:r>
     </w:p>
     <w:p>
@@ -2070,7 +1693,6 @@
         </w:rPr>
         <w:t xml:space="preserve"> </w:t>
       </w:r>
-      <w:proofErr w:type="spellStart"/>
       <w:r>
         <w:rPr>
           <w:rFonts w:ascii="Consolas" w:eastAsia="Times New Roman" w:hAnsi="Consolas" w:cs="Times New Roman"/>
@@ -2081,7 +1703,6 @@
         </w:rPr>
         <w:t>useSetState</w:t>
       </w:r>
-      <w:proofErr w:type="spellEnd"/>
       <w:r>
         <w:rPr>
           <w:rFonts w:ascii="Consolas" w:eastAsia="Times New Roman" w:hAnsi="Consolas" w:cs="Times New Roman"/>
@@ -2367,7 +1988,6 @@
         </w:rPr>
         <w:t xml:space="preserve"> </w:t>
       </w:r>
-      <w:proofErr w:type="spellStart"/>
       <w:r>
         <w:rPr>
           <w:rFonts w:ascii="Consolas" w:eastAsia="Times New Roman" w:hAnsi="Consolas" w:cs="Times New Roman"/>
@@ -2378,7 +1998,6 @@
         </w:rPr>
         <w:t>currentFilters</w:t>
       </w:r>
-      <w:proofErr w:type="spellEnd"/>
       <w:r>
         <w:rPr>
           <w:rFonts w:ascii="Consolas" w:eastAsia="Times New Roman" w:hAnsi="Consolas" w:cs="Times New Roman"/>
@@ -2399,7 +2018,6 @@
         </w:rPr>
         <w:t xml:space="preserve"> </w:t>
       </w:r>
-      <w:proofErr w:type="spellStart"/>
       <w:r>
         <w:rPr>
           <w:rFonts w:ascii="Consolas" w:eastAsia="Times New Roman" w:hAnsi="Consolas" w:cs="Times New Roman"/>
@@ -2410,7 +2028,6 @@
         </w:rPr>
         <w:t>setState</w:t>
       </w:r>
-      <w:proofErr w:type="spellEnd"/>
       <w:r>
         <w:rPr>
           <w:rFonts w:ascii="Consolas" w:eastAsia="Times New Roman" w:hAnsi="Consolas" w:cs="Times New Roman"/>
@@ -2431,7 +2048,6 @@
         </w:rPr>
         <w:t xml:space="preserve"> </w:t>
       </w:r>
-      <w:proofErr w:type="spellStart"/>
       <w:r>
         <w:rPr>
           <w:rFonts w:ascii="Consolas" w:eastAsia="Times New Roman" w:hAnsi="Consolas" w:cs="Times New Roman"/>
@@ -2442,7 +2058,6 @@
         </w:rPr>
         <w:t>updateFilters</w:t>
       </w:r>
-      <w:proofErr w:type="spellEnd"/>
       <w:r>
         <w:rPr>
           <w:rFonts w:ascii="Consolas" w:eastAsia="Times New Roman" w:hAnsi="Consolas" w:cs="Times New Roman"/>
@@ -2561,7 +2176,6 @@
         </w:rPr>
         <w:t xml:space="preserve"> </w:t>
       </w:r>
-      <w:proofErr w:type="spellStart"/>
       <w:r>
         <w:rPr>
           <w:rFonts w:ascii="Consolas" w:eastAsia="Times New Roman" w:hAnsi="Consolas" w:cs="Times New Roman"/>
@@ -2573,7 +2187,6 @@
         </w:rPr>
         <w:t>searchParams</w:t>
       </w:r>
-      <w:proofErr w:type="spellEnd"/>
       <w:r>
         <w:rPr>
           <w:rFonts w:ascii="Consolas" w:eastAsia="Times New Roman" w:hAnsi="Consolas" w:cs="Times New Roman"/>
@@ -2607,7 +2220,6 @@
         </w:rPr>
         <w:t xml:space="preserve"> </w:t>
       </w:r>
-      <w:proofErr w:type="spellStart"/>
       <w:r>
         <w:rPr>
           <w:rFonts w:ascii="Consolas" w:eastAsia="Times New Roman" w:hAnsi="Consolas" w:cs="Times New Roman"/>
@@ -2619,7 +2231,6 @@
         </w:rPr>
         <w:t>useSearchParams</w:t>
       </w:r>
-      <w:proofErr w:type="spellEnd"/>
       <w:r>
         <w:rPr>
           <w:rFonts w:ascii="Consolas" w:eastAsia="Times New Roman" w:hAnsi="Consolas" w:cs="Times New Roman"/>
@@ -2691,7 +2302,6 @@
         </w:rPr>
         <w:t xml:space="preserve"> </w:t>
       </w:r>
-      <w:proofErr w:type="spellStart"/>
       <w:r>
         <w:rPr>
           <w:rFonts w:ascii="Consolas" w:eastAsia="Times New Roman" w:hAnsi="Consolas" w:cs="Times New Roman"/>
@@ -2703,7 +2313,6 @@
         </w:rPr>
         <w:t>nationalParam</w:t>
       </w:r>
-      <w:proofErr w:type="spellEnd"/>
       <w:r>
         <w:rPr>
           <w:rFonts w:ascii="Consolas" w:eastAsia="Times New Roman" w:hAnsi="Consolas" w:cs="Times New Roman"/>
@@ -2737,7 +2346,6 @@
         </w:rPr>
         <w:t xml:space="preserve"> </w:t>
       </w:r>
-      <w:proofErr w:type="spellStart"/>
       <w:r>
         <w:rPr>
           <w:rFonts w:ascii="Consolas" w:eastAsia="Times New Roman" w:hAnsi="Consolas" w:cs="Times New Roman"/>
@@ -2771,7 +2379,6 @@
         </w:rPr>
         <w:t>get</w:t>
       </w:r>
-      <w:proofErr w:type="spellEnd"/>
       <w:r>
         <w:rPr>
           <w:rFonts w:ascii="Consolas" w:eastAsia="Times New Roman" w:hAnsi="Consolas" w:cs="Times New Roman"/>
@@ -2789,7 +2396,7 @@
           <w:color w:val="89DDFF"/>
           <w:sz w:val="21"/>
           <w:szCs w:val="21"/>
-          <w:highlight w:val="darkGreen"/>
+          <w:highlight w:val="yellow"/>
           <w:lang w:eastAsia="es-419"/>
         </w:rPr>
         <w:t>'</w:t>
@@ -2800,7 +2407,7 @@
           <w:color w:val="9ECE6A"/>
           <w:sz w:val="21"/>
           <w:szCs w:val="21"/>
-          <w:highlight w:val="darkGreen"/>
+          <w:highlight w:val="yellow"/>
           <w:lang w:eastAsia="es-419"/>
         </w:rPr>
         <w:t>national</w:t>
@@ -2811,7 +2418,7 @@
           <w:color w:val="89DDFF"/>
           <w:sz w:val="21"/>
           <w:szCs w:val="21"/>
-          <w:highlight w:val="darkGreen"/>
+          <w:highlight w:val="yellow"/>
           <w:lang w:eastAsia="es-419"/>
         </w:rPr>
         <w:t>'</w:t>
@@ -2862,7 +2469,6 @@
         </w:rPr>
         <w:t xml:space="preserve">  </w:t>
       </w:r>
-      <w:proofErr w:type="spellStart"/>
       <w:r>
         <w:rPr>
           <w:rFonts w:ascii="Consolas" w:eastAsia="Times New Roman" w:hAnsi="Consolas" w:cs="Times New Roman"/>
@@ -2876,7 +2482,6 @@
         </w:rPr>
         <w:t>const</w:t>
       </w:r>
-      <w:proofErr w:type="spellEnd"/>
       <w:r>
         <w:rPr>
           <w:rFonts w:ascii="Consolas" w:eastAsia="Times New Roman" w:hAnsi="Consolas" w:cs="Times New Roman"/>
@@ -2888,7 +2493,6 @@
         </w:rPr>
         <w:t xml:space="preserve"> </w:t>
       </w:r>
-      <w:proofErr w:type="spellStart"/>
       <w:r>
         <w:rPr>
           <w:rFonts w:ascii="Consolas" w:eastAsia="Times New Roman" w:hAnsi="Consolas" w:cs="Times New Roman"/>
@@ -2900,7 +2504,6 @@
         </w:rPr>
         <w:t>isFirstLoad</w:t>
       </w:r>
-      <w:proofErr w:type="spellEnd"/>
       <w:r>
         <w:rPr>
           <w:rFonts w:ascii="Consolas" w:eastAsia="Times New Roman" w:hAnsi="Consolas" w:cs="Times New Roman"/>
@@ -2934,7 +2537,6 @@
         </w:rPr>
         <w:t xml:space="preserve"> </w:t>
       </w:r>
-      <w:proofErr w:type="spellStart"/>
       <w:r>
         <w:rPr>
           <w:rFonts w:ascii="Consolas" w:eastAsia="Times New Roman" w:hAnsi="Consolas" w:cs="Times New Roman"/>
@@ -2946,7 +2548,6 @@
         </w:rPr>
         <w:t>useRef</w:t>
       </w:r>
-      <w:proofErr w:type="spellEnd"/>
       <w:r>
         <w:rPr>
           <w:rFonts w:ascii="Consolas" w:eastAsia="Times New Roman" w:hAnsi="Consolas" w:cs="Times New Roman"/>
@@ -3027,7 +2628,6 @@
         </w:rPr>
         <w:t xml:space="preserve">  </w:t>
       </w:r>
-      <w:proofErr w:type="spellStart"/>
       <w:r>
         <w:rPr>
           <w:rFonts w:ascii="Consolas" w:eastAsia="Times New Roman" w:hAnsi="Consolas" w:cs="Times New Roman"/>
@@ -3038,7 +2638,6 @@
         </w:rPr>
         <w:t>useEffect</w:t>
       </w:r>
-      <w:proofErr w:type="spellEnd"/>
       <w:r>
         <w:rPr>
           <w:rFonts w:ascii="Consolas" w:eastAsia="Times New Roman" w:hAnsi="Consolas" w:cs="Times New Roman"/>
@@ -3122,7 +2721,6 @@
         </w:rPr>
         <w:t>!</w:t>
       </w:r>
-      <w:proofErr w:type="spellStart"/>
       <w:r>
         <w:rPr>
           <w:rFonts w:ascii="Consolas" w:eastAsia="Times New Roman" w:hAnsi="Consolas" w:cs="Times New Roman"/>
@@ -3133,7 +2731,6 @@
         </w:rPr>
         <w:t>nationalParam</w:t>
       </w:r>
-      <w:proofErr w:type="spellEnd"/>
       <w:r>
         <w:rPr>
           <w:rFonts w:ascii="Consolas" w:eastAsia="Times New Roman" w:hAnsi="Consolas" w:cs="Times New Roman"/>
@@ -3174,7 +2771,6 @@
         </w:rPr>
         <w:t>!</w:t>
       </w:r>
-      <w:proofErr w:type="spellStart"/>
       <w:r>
         <w:rPr>
           <w:rFonts w:ascii="Consolas" w:eastAsia="Times New Roman" w:hAnsi="Consolas" w:cs="Times New Roman"/>
@@ -3205,7 +2801,6 @@
         </w:rPr>
         <w:t>current</w:t>
       </w:r>
-      <w:proofErr w:type="spellEnd"/>
       <w:r>
         <w:rPr>
           <w:rFonts w:ascii="Consolas" w:eastAsia="Times New Roman" w:hAnsi="Consolas" w:cs="Times New Roman"/>
@@ -3274,7 +2869,6 @@
         </w:rPr>
         <w:t xml:space="preserve">    </w:t>
       </w:r>
-      <w:proofErr w:type="spellStart"/>
       <w:r>
         <w:rPr>
           <w:rFonts w:ascii="Consolas" w:eastAsia="Times New Roman" w:hAnsi="Consolas" w:cs="Times New Roman"/>
@@ -3285,7 +2879,6 @@
         </w:rPr>
         <w:t>updateFilters</w:t>
       </w:r>
-      <w:proofErr w:type="spellEnd"/>
       <w:r>
         <w:rPr>
           <w:rFonts w:ascii="Consolas" w:eastAsia="Times New Roman" w:hAnsi="Consolas" w:cs="Times New Roman"/>
@@ -3319,18 +2912,17 @@
         </w:rPr>
         <w:t xml:space="preserve">      </w:t>
       </w:r>
-      <w:proofErr w:type="spellStart"/>
       <w:r>
         <w:rPr>
           <w:rFonts w:ascii="Consolas" w:eastAsia="Times New Roman" w:hAnsi="Consolas" w:cs="Times New Roman"/>
           <w:color w:val="73DACA"/>
           <w:sz w:val="21"/>
           <w:szCs w:val="21"/>
+          <w:highlight w:val="yellow"/>
           <w:lang w:eastAsia="es-419"/>
         </w:rPr>
         <w:t>regionalFullName</w:t>
       </w:r>
-      <w:proofErr w:type="spellEnd"/>
       <w:r>
         <w:rPr>
           <w:rFonts w:ascii="Consolas" w:eastAsia="Times New Roman" w:hAnsi="Consolas" w:cs="Times New Roman"/>
@@ -3351,18 +2943,17 @@
         </w:rPr>
         <w:t xml:space="preserve"> [</w:t>
       </w:r>
-      <w:proofErr w:type="spellStart"/>
       <w:r>
         <w:rPr>
           <w:rFonts w:ascii="Consolas" w:eastAsia="Times New Roman" w:hAnsi="Consolas" w:cs="Times New Roman"/>
           <w:color w:val="7DCFFF"/>
           <w:sz w:val="21"/>
           <w:szCs w:val="21"/>
+          <w:highlight w:val="yellow"/>
           <w:lang w:eastAsia="es-419"/>
         </w:rPr>
         <w:t>nationalParam</w:t>
       </w:r>
-      <w:proofErr w:type="spellEnd"/>
       <w:r>
         <w:rPr>
           <w:rFonts w:ascii="Consolas" w:eastAsia="Times New Roman" w:hAnsi="Consolas" w:cs="Times New Roman"/>
@@ -3452,7 +3043,6 @@
         </w:rPr>
         <w:t xml:space="preserve">    </w:t>
       </w:r>
-      <w:proofErr w:type="spellStart"/>
       <w:r>
         <w:rPr>
           <w:rFonts w:ascii="Consolas" w:eastAsia="Times New Roman" w:hAnsi="Consolas" w:cs="Times New Roman"/>
@@ -3483,7 +3073,6 @@
         </w:rPr>
         <w:t>current</w:t>
       </w:r>
-      <w:proofErr w:type="spellEnd"/>
       <w:r>
         <w:rPr>
           <w:rFonts w:ascii="Consolas" w:eastAsia="Times New Roman" w:hAnsi="Consolas" w:cs="Times New Roman"/>
@@ -3587,18 +3176,17 @@
         </w:rPr>
         <w:t xml:space="preserve"> [</w:t>
       </w:r>
-      <w:proofErr w:type="spellStart"/>
       <w:r>
         <w:rPr>
           <w:rFonts w:ascii="Consolas" w:eastAsia="Times New Roman" w:hAnsi="Consolas" w:cs="Times New Roman"/>
           <w:color w:val="7DCFFF"/>
           <w:sz w:val="21"/>
           <w:szCs w:val="21"/>
+          <w:highlight w:val="yellow"/>
           <w:lang w:val="es-419" w:eastAsia="es-419"/>
         </w:rPr>
         <w:t>nationalParam</w:t>
       </w:r>
-      <w:proofErr w:type="spellEnd"/>
       <w:r>
         <w:rPr>
           <w:rFonts w:ascii="Consolas" w:eastAsia="Times New Roman" w:hAnsi="Consolas" w:cs="Times New Roman"/>
@@ -3619,7 +3207,6 @@
         </w:rPr>
         <w:t xml:space="preserve"> </w:t>
       </w:r>
-      <w:proofErr w:type="spellStart"/>
       <w:r>
         <w:rPr>
           <w:rFonts w:ascii="Consolas" w:eastAsia="Times New Roman" w:hAnsi="Consolas" w:cs="Times New Roman"/>
@@ -3630,7 +3217,6 @@
         </w:rPr>
         <w:t>updateFilters</w:t>
       </w:r>
-      <w:proofErr w:type="spellEnd"/>
       <w:r>
         <w:rPr>
           <w:rFonts w:ascii="Consolas" w:eastAsia="Times New Roman" w:hAnsi="Consolas" w:cs="Times New Roman"/>
@@ -3678,7 +3264,2856 @@
           <w:lang w:val="es-419"/>
         </w:rPr>
       </w:pPr>
+      <w:r>
+        <w:rPr>
+          <w:lang w:val="es-419"/>
+        </w:rPr>
+        <w:br w:type="page"/>
+      </w:r>
     </w:p>
+    <w:p>
+      <w:pPr>
+        <w:rPr>
+          <w:lang w:val="es-419"/>
+        </w:rPr>
+      </w:pPr>
+      <w:r>
+        <w:rPr>
+          <w:lang w:val="es-419"/>
+        </w:rPr>
+        <w:lastRenderedPageBreak/>
+        <w:t>Error de string a array</w:t>
+      </w:r>
+    </w:p>
+    <w:p>
+      <w:pPr>
+        <w:shd w:val="clear" w:color="auto" w:fill="FFFFFF"/>
+        <w:spacing w:line="240" w:lineRule="auto"/>
+        <w:rPr>
+          <w:rFonts w:ascii="Source Sans Pro" w:eastAsia="Times New Roman" w:hAnsi="Source Sans Pro" w:cs="Times New Roman"/>
+          <w:color w:val="757575"/>
+          <w:sz w:val="24"/>
+          <w:szCs w:val="24"/>
+          <w:lang w:eastAsia="es-419"/>
+        </w:rPr>
+      </w:pPr>
+      <w:r>
+        <w:rPr>
+          <w:rFonts w:ascii="Consolas" w:eastAsia="Times New Roman" w:hAnsi="Consolas" w:cs="Times New Roman"/>
+          <w:b/>
+          <w:bCs/>
+          <w:color w:val="CA2A30"/>
+          <w:sz w:val="18"/>
+          <w:szCs w:val="18"/>
+          <w:lang w:eastAsia="es-419"/>
+        </w:rPr>
+        <w:t>Runtime TypeError</w:t>
+      </w:r>
+    </w:p>
+    <w:p>
+      <w:pPr>
+        <w:shd w:val="clear" w:color="auto" w:fill="FFFFFF"/>
+        <w:spacing w:after="120" w:line="360" w:lineRule="atLeast"/>
+        <w:rPr>
+          <w:rFonts w:ascii="Source Sans Pro" w:eastAsia="Times New Roman" w:hAnsi="Source Sans Pro" w:cs="Times New Roman"/>
+          <w:color w:val="CA2A30"/>
+          <w:spacing w:val="-5"/>
+          <w:sz w:val="24"/>
+          <w:szCs w:val="24"/>
+          <w:lang w:eastAsia="es-419"/>
+        </w:rPr>
+      </w:pPr>
+      <w:r>
+        <w:rPr>
+          <w:rFonts w:ascii="Source Sans Pro" w:eastAsia="Times New Roman" w:hAnsi="Source Sans Pro" w:cs="Times New Roman"/>
+          <w:color w:val="CA2A30"/>
+          <w:spacing w:val="-5"/>
+          <w:sz w:val="24"/>
+          <w:szCs w:val="24"/>
+          <w:lang w:eastAsia="es-419"/>
+        </w:rPr>
+        <w:t>selected.map is not a function</w:t>
+      </w:r>
+    </w:p>
+    <w:p>
+      <w:pPr>
+        <w:spacing w:after="0" w:line="240" w:lineRule="atLeast"/>
+        <w:rPr>
+          <w:rFonts w:ascii="Consolas" w:eastAsia="Times New Roman" w:hAnsi="Consolas" w:cs="Times New Roman"/>
+          <w:color w:val="171717"/>
+          <w:sz w:val="18"/>
+          <w:szCs w:val="18"/>
+          <w:lang w:eastAsia="es-419"/>
+        </w:rPr>
+      </w:pPr>
+      <w:r>
+        <w:rPr>
+          <w:rFonts w:ascii="Consolas" w:eastAsia="Times New Roman" w:hAnsi="Consolas" w:cs="Times New Roman"/>
+          <w:color w:val="171717"/>
+          <w:sz w:val="18"/>
+          <w:szCs w:val="18"/>
+          <w:lang w:eastAsia="es-419"/>
+        </w:rPr>
+        <w:t>src/sections/dest/dest-table-toolbar.jsx (89:49) @ renderValue</w:t>
+      </w:r>
+    </w:p>
+    <w:p>
+      <w:pPr>
+        <w:tabs>
+          <w:tab w:val="left" w:pos="916"/>
+          <w:tab w:val="left" w:pos="1832"/>
+          <w:tab w:val="left" w:pos="2748"/>
+          <w:tab w:val="left" w:pos="3664"/>
+          <w:tab w:val="left" w:pos="4580"/>
+          <w:tab w:val="left" w:pos="5496"/>
+          <w:tab w:val="left" w:pos="6412"/>
+          <w:tab w:val="left" w:pos="7328"/>
+          <w:tab w:val="left" w:pos="8244"/>
+          <w:tab w:val="left" w:pos="9160"/>
+          <w:tab w:val="left" w:pos="10076"/>
+          <w:tab w:val="left" w:pos="10992"/>
+          <w:tab w:val="left" w:pos="11908"/>
+          <w:tab w:val="left" w:pos="12824"/>
+          <w:tab w:val="left" w:pos="13740"/>
+          <w:tab w:val="left" w:pos="14656"/>
+        </w:tabs>
+        <w:spacing w:after="0" w:line="240" w:lineRule="atLeast"/>
+        <w:rPr>
+          <w:rFonts w:ascii="Consolas" w:eastAsia="Times New Roman" w:hAnsi="Consolas" w:cs="Courier New"/>
+          <w:color w:val="171717"/>
+          <w:sz w:val="18"/>
+          <w:szCs w:val="18"/>
+          <w:lang w:eastAsia="es-419"/>
+        </w:rPr>
+      </w:pPr>
+      <w:r>
+        <w:rPr>
+          <w:rFonts w:ascii="Consolas" w:eastAsia="Times New Roman" w:hAnsi="Consolas" w:cs="Courier New"/>
+          <w:color w:val="171717"/>
+          <w:sz w:val="18"/>
+          <w:szCs w:val="18"/>
+          <w:lang w:eastAsia="es-419"/>
+        </w:rPr>
+        <w:t xml:space="preserve"> </w:t>
+      </w:r>
+      <w:r>
+        <w:rPr>
+          <w:rFonts w:ascii="Consolas" w:eastAsia="Times New Roman" w:hAnsi="Consolas" w:cs="Courier New"/>
+          <w:color w:val="545454"/>
+          <w:sz w:val="18"/>
+          <w:szCs w:val="18"/>
+          <w:lang w:eastAsia="es-419"/>
+        </w:rPr>
+        <w:t xml:space="preserve"> 87 |</w:t>
+      </w:r>
+      <w:r>
+        <w:rPr>
+          <w:rFonts w:ascii="Consolas" w:eastAsia="Times New Roman" w:hAnsi="Consolas" w:cs="Courier New"/>
+          <w:color w:val="171717"/>
+          <w:sz w:val="18"/>
+          <w:szCs w:val="18"/>
+          <w:lang w:eastAsia="es-419"/>
+        </w:rPr>
+        <w:t xml:space="preserve">             value</w:t>
+      </w:r>
+      <w:r>
+        <w:rPr>
+          <w:rFonts w:ascii="Consolas" w:eastAsia="Times New Roman" w:hAnsi="Consolas" w:cs="Courier New"/>
+          <w:color w:val="0054AD"/>
+          <w:sz w:val="18"/>
+          <w:szCs w:val="18"/>
+          <w:lang w:eastAsia="es-419"/>
+        </w:rPr>
+        <w:t>=</w:t>
+      </w:r>
+      <w:r>
+        <w:rPr>
+          <w:rFonts w:ascii="Consolas" w:eastAsia="Times New Roman" w:hAnsi="Consolas" w:cs="Courier New"/>
+          <w:color w:val="171717"/>
+          <w:sz w:val="18"/>
+          <w:szCs w:val="18"/>
+          <w:lang w:eastAsia="es-419"/>
+        </w:rPr>
+        <w:t>{currentFilters</w:t>
+      </w:r>
+      <w:r>
+        <w:rPr>
+          <w:rFonts w:ascii="Consolas" w:eastAsia="Times New Roman" w:hAnsi="Consolas" w:cs="Courier New"/>
+          <w:color w:val="0054AD"/>
+          <w:sz w:val="18"/>
+          <w:szCs w:val="18"/>
+          <w:lang w:eastAsia="es-419"/>
+        </w:rPr>
+        <w:t>.</w:t>
+      </w:r>
+      <w:r>
+        <w:rPr>
+          <w:rFonts w:ascii="Consolas" w:eastAsia="Times New Roman" w:hAnsi="Consolas" w:cs="Courier New"/>
+          <w:color w:val="171717"/>
+          <w:sz w:val="18"/>
+          <w:szCs w:val="18"/>
+          <w:lang w:eastAsia="es-419"/>
+        </w:rPr>
+        <w:t>sectionalFullName}</w:t>
+      </w:r>
+    </w:p>
+    <w:p>
+      <w:pPr>
+        <w:tabs>
+          <w:tab w:val="left" w:pos="916"/>
+          <w:tab w:val="left" w:pos="1832"/>
+          <w:tab w:val="left" w:pos="2748"/>
+          <w:tab w:val="left" w:pos="3664"/>
+          <w:tab w:val="left" w:pos="4580"/>
+          <w:tab w:val="left" w:pos="5496"/>
+          <w:tab w:val="left" w:pos="6412"/>
+          <w:tab w:val="left" w:pos="7328"/>
+          <w:tab w:val="left" w:pos="8244"/>
+          <w:tab w:val="left" w:pos="9160"/>
+          <w:tab w:val="left" w:pos="10076"/>
+          <w:tab w:val="left" w:pos="10992"/>
+          <w:tab w:val="left" w:pos="11908"/>
+          <w:tab w:val="left" w:pos="12824"/>
+          <w:tab w:val="left" w:pos="13740"/>
+          <w:tab w:val="left" w:pos="14656"/>
+        </w:tabs>
+        <w:spacing w:after="0" w:line="240" w:lineRule="atLeast"/>
+        <w:rPr>
+          <w:rFonts w:ascii="Consolas" w:eastAsia="Times New Roman" w:hAnsi="Consolas" w:cs="Courier New"/>
+          <w:color w:val="171717"/>
+          <w:sz w:val="18"/>
+          <w:szCs w:val="18"/>
+          <w:lang w:eastAsia="es-419"/>
+        </w:rPr>
+      </w:pPr>
+      <w:r>
+        <w:rPr>
+          <w:rFonts w:ascii="Consolas" w:eastAsia="Times New Roman" w:hAnsi="Consolas" w:cs="Courier New"/>
+          <w:color w:val="171717"/>
+          <w:sz w:val="18"/>
+          <w:szCs w:val="18"/>
+          <w:lang w:eastAsia="es-419"/>
+        </w:rPr>
+        <w:t xml:space="preserve"> </w:t>
+      </w:r>
+      <w:r>
+        <w:rPr>
+          <w:rFonts w:ascii="Consolas" w:eastAsia="Times New Roman" w:hAnsi="Consolas" w:cs="Courier New"/>
+          <w:color w:val="545454"/>
+          <w:sz w:val="18"/>
+          <w:szCs w:val="18"/>
+          <w:lang w:eastAsia="es-419"/>
+        </w:rPr>
+        <w:t xml:space="preserve"> 88 |</w:t>
+      </w:r>
+      <w:r>
+        <w:rPr>
+          <w:rFonts w:ascii="Consolas" w:eastAsia="Times New Roman" w:hAnsi="Consolas" w:cs="Courier New"/>
+          <w:color w:val="171717"/>
+          <w:sz w:val="18"/>
+          <w:szCs w:val="18"/>
+          <w:lang w:eastAsia="es-419"/>
+        </w:rPr>
+        <w:t xml:space="preserve">             onChange</w:t>
+      </w:r>
+      <w:r>
+        <w:rPr>
+          <w:rFonts w:ascii="Consolas" w:eastAsia="Times New Roman" w:hAnsi="Consolas" w:cs="Courier New"/>
+          <w:color w:val="0054AD"/>
+          <w:sz w:val="18"/>
+          <w:szCs w:val="18"/>
+          <w:lang w:eastAsia="es-419"/>
+        </w:rPr>
+        <w:t>=</w:t>
+      </w:r>
+      <w:r>
+        <w:rPr>
+          <w:rFonts w:ascii="Consolas" w:eastAsia="Times New Roman" w:hAnsi="Consolas" w:cs="Courier New"/>
+          <w:color w:val="171717"/>
+          <w:sz w:val="18"/>
+          <w:szCs w:val="18"/>
+          <w:lang w:eastAsia="es-419"/>
+        </w:rPr>
+        <w:t>{handleFilterSectionalFullName}</w:t>
+      </w:r>
+    </w:p>
+    <w:p>
+      <w:pPr>
+        <w:tabs>
+          <w:tab w:val="left" w:pos="916"/>
+          <w:tab w:val="left" w:pos="1832"/>
+          <w:tab w:val="left" w:pos="2748"/>
+          <w:tab w:val="left" w:pos="3664"/>
+          <w:tab w:val="left" w:pos="4580"/>
+          <w:tab w:val="left" w:pos="5496"/>
+          <w:tab w:val="left" w:pos="6412"/>
+          <w:tab w:val="left" w:pos="7328"/>
+          <w:tab w:val="left" w:pos="8244"/>
+          <w:tab w:val="left" w:pos="9160"/>
+          <w:tab w:val="left" w:pos="10076"/>
+          <w:tab w:val="left" w:pos="10992"/>
+          <w:tab w:val="left" w:pos="11908"/>
+          <w:tab w:val="left" w:pos="12824"/>
+          <w:tab w:val="left" w:pos="13740"/>
+          <w:tab w:val="left" w:pos="14656"/>
+        </w:tabs>
+        <w:spacing w:after="0" w:line="240" w:lineRule="atLeast"/>
+        <w:rPr>
+          <w:rFonts w:ascii="Consolas" w:eastAsia="Times New Roman" w:hAnsi="Consolas" w:cs="Courier New"/>
+          <w:color w:val="171717"/>
+          <w:sz w:val="18"/>
+          <w:szCs w:val="18"/>
+          <w:lang w:eastAsia="es-419"/>
+        </w:rPr>
+      </w:pPr>
+      <w:r>
+        <w:rPr>
+          <w:rFonts w:ascii="Consolas" w:eastAsia="Times New Roman" w:hAnsi="Consolas" w:cs="Courier New"/>
+          <w:color w:val="E5484D"/>
+          <w:sz w:val="18"/>
+          <w:szCs w:val="18"/>
+          <w:lang w:eastAsia="es-419"/>
+        </w:rPr>
+        <w:t>&gt;</w:t>
+      </w:r>
+      <w:r>
+        <w:rPr>
+          <w:rFonts w:ascii="Consolas" w:eastAsia="Times New Roman" w:hAnsi="Consolas" w:cs="Courier New"/>
+          <w:color w:val="545454"/>
+          <w:sz w:val="18"/>
+          <w:szCs w:val="18"/>
+          <w:lang w:eastAsia="es-419"/>
+        </w:rPr>
+        <w:t xml:space="preserve"> 89 |</w:t>
+      </w:r>
+      <w:r>
+        <w:rPr>
+          <w:rFonts w:ascii="Consolas" w:eastAsia="Times New Roman" w:hAnsi="Consolas" w:cs="Courier New"/>
+          <w:color w:val="171717"/>
+          <w:sz w:val="18"/>
+          <w:szCs w:val="18"/>
+          <w:lang w:eastAsia="es-419"/>
+        </w:rPr>
+        <w:t xml:space="preserve">             renderValue</w:t>
+      </w:r>
+      <w:r>
+        <w:rPr>
+          <w:rFonts w:ascii="Consolas" w:eastAsia="Times New Roman" w:hAnsi="Consolas" w:cs="Courier New"/>
+          <w:color w:val="0054AD"/>
+          <w:sz w:val="18"/>
+          <w:szCs w:val="18"/>
+          <w:lang w:eastAsia="es-419"/>
+        </w:rPr>
+        <w:t>=</w:t>
+      </w:r>
+      <w:r>
+        <w:rPr>
+          <w:rFonts w:ascii="Consolas" w:eastAsia="Times New Roman" w:hAnsi="Consolas" w:cs="Courier New"/>
+          <w:color w:val="171717"/>
+          <w:sz w:val="18"/>
+          <w:szCs w:val="18"/>
+          <w:lang w:eastAsia="es-419"/>
+        </w:rPr>
+        <w:t xml:space="preserve">{(selected) </w:t>
+      </w:r>
+      <w:r>
+        <w:rPr>
+          <w:rFonts w:ascii="Consolas" w:eastAsia="Times New Roman" w:hAnsi="Consolas" w:cs="Courier New"/>
+          <w:color w:val="0054AD"/>
+          <w:sz w:val="18"/>
+          <w:szCs w:val="18"/>
+          <w:lang w:eastAsia="es-419"/>
+        </w:rPr>
+        <w:t>=&gt;</w:t>
+      </w:r>
+      <w:r>
+        <w:rPr>
+          <w:rFonts w:ascii="Consolas" w:eastAsia="Times New Roman" w:hAnsi="Consolas" w:cs="Courier New"/>
+          <w:color w:val="171717"/>
+          <w:sz w:val="18"/>
+          <w:szCs w:val="18"/>
+          <w:lang w:eastAsia="es-419"/>
+        </w:rPr>
+        <w:t xml:space="preserve"> selected</w:t>
+      </w:r>
+      <w:r>
+        <w:rPr>
+          <w:rFonts w:ascii="Consolas" w:eastAsia="Times New Roman" w:hAnsi="Consolas" w:cs="Courier New"/>
+          <w:color w:val="0054AD"/>
+          <w:sz w:val="18"/>
+          <w:szCs w:val="18"/>
+          <w:lang w:eastAsia="es-419"/>
+        </w:rPr>
+        <w:t>.</w:t>
+      </w:r>
+      <w:r>
+        <w:rPr>
+          <w:rFonts w:ascii="Consolas" w:eastAsia="Times New Roman" w:hAnsi="Consolas" w:cs="Courier New"/>
+          <w:color w:val="171717"/>
+          <w:sz w:val="18"/>
+          <w:szCs w:val="18"/>
+          <w:lang w:eastAsia="es-419"/>
+        </w:rPr>
+        <w:t xml:space="preserve">map((value) </w:t>
+      </w:r>
+      <w:r>
+        <w:rPr>
+          <w:rFonts w:ascii="Consolas" w:eastAsia="Times New Roman" w:hAnsi="Consolas" w:cs="Courier New"/>
+          <w:color w:val="0054AD"/>
+          <w:sz w:val="18"/>
+          <w:szCs w:val="18"/>
+          <w:lang w:eastAsia="es-419"/>
+        </w:rPr>
+        <w:t>=&gt;</w:t>
+      </w:r>
+      <w:r>
+        <w:rPr>
+          <w:rFonts w:ascii="Consolas" w:eastAsia="Times New Roman" w:hAnsi="Consolas" w:cs="Courier New"/>
+          <w:color w:val="171717"/>
+          <w:sz w:val="18"/>
+          <w:szCs w:val="18"/>
+          <w:lang w:eastAsia="es-419"/>
+        </w:rPr>
+        <w:t xml:space="preserve"> value)</w:t>
+      </w:r>
+      <w:r>
+        <w:rPr>
+          <w:rFonts w:ascii="Consolas" w:eastAsia="Times New Roman" w:hAnsi="Consolas" w:cs="Courier New"/>
+          <w:color w:val="0054AD"/>
+          <w:sz w:val="18"/>
+          <w:szCs w:val="18"/>
+          <w:lang w:eastAsia="es-419"/>
+        </w:rPr>
+        <w:t>.</w:t>
+      </w:r>
+      <w:r>
+        <w:rPr>
+          <w:rFonts w:ascii="Consolas" w:eastAsia="Times New Roman" w:hAnsi="Consolas" w:cs="Courier New"/>
+          <w:color w:val="171717"/>
+          <w:sz w:val="18"/>
+          <w:szCs w:val="18"/>
+          <w:lang w:eastAsia="es-419"/>
+        </w:rPr>
+        <w:t>join(</w:t>
+      </w:r>
+      <w:r>
+        <w:rPr>
+          <w:rFonts w:ascii="Consolas" w:eastAsia="Times New Roman" w:hAnsi="Consolas" w:cs="Courier New"/>
+          <w:color w:val="036157"/>
+          <w:sz w:val="18"/>
+          <w:szCs w:val="18"/>
+          <w:lang w:eastAsia="es-419"/>
+        </w:rPr>
+        <w:t>', '</w:t>
+      </w:r>
+      <w:r>
+        <w:rPr>
+          <w:rFonts w:ascii="Consolas" w:eastAsia="Times New Roman" w:hAnsi="Consolas" w:cs="Courier New"/>
+          <w:color w:val="171717"/>
+          <w:sz w:val="18"/>
+          <w:szCs w:val="18"/>
+          <w:lang w:eastAsia="es-419"/>
+        </w:rPr>
+        <w:t>)}</w:t>
+      </w:r>
+    </w:p>
+    <w:p>
+      <w:pPr>
+        <w:tabs>
+          <w:tab w:val="left" w:pos="916"/>
+          <w:tab w:val="left" w:pos="1832"/>
+          <w:tab w:val="left" w:pos="2748"/>
+          <w:tab w:val="left" w:pos="3664"/>
+          <w:tab w:val="left" w:pos="4580"/>
+          <w:tab w:val="left" w:pos="5496"/>
+          <w:tab w:val="left" w:pos="6412"/>
+          <w:tab w:val="left" w:pos="7328"/>
+          <w:tab w:val="left" w:pos="8244"/>
+          <w:tab w:val="left" w:pos="9160"/>
+          <w:tab w:val="left" w:pos="10076"/>
+          <w:tab w:val="left" w:pos="10992"/>
+          <w:tab w:val="left" w:pos="11908"/>
+          <w:tab w:val="left" w:pos="12824"/>
+          <w:tab w:val="left" w:pos="13740"/>
+          <w:tab w:val="left" w:pos="14656"/>
+        </w:tabs>
+        <w:spacing w:after="0" w:line="240" w:lineRule="atLeast"/>
+        <w:rPr>
+          <w:rFonts w:ascii="Consolas" w:eastAsia="Times New Roman" w:hAnsi="Consolas" w:cs="Courier New"/>
+          <w:color w:val="171717"/>
+          <w:sz w:val="18"/>
+          <w:szCs w:val="18"/>
+          <w:lang w:eastAsia="es-419"/>
+        </w:rPr>
+      </w:pPr>
+      <w:r>
+        <w:rPr>
+          <w:rFonts w:ascii="Consolas" w:eastAsia="Times New Roman" w:hAnsi="Consolas" w:cs="Courier New"/>
+          <w:color w:val="171717"/>
+          <w:sz w:val="18"/>
+          <w:szCs w:val="18"/>
+          <w:lang w:eastAsia="es-419"/>
+        </w:rPr>
+        <w:t xml:space="preserve"> </w:t>
+      </w:r>
+      <w:r>
+        <w:rPr>
+          <w:rFonts w:ascii="Consolas" w:eastAsia="Times New Roman" w:hAnsi="Consolas" w:cs="Courier New"/>
+          <w:color w:val="545454"/>
+          <w:sz w:val="18"/>
+          <w:szCs w:val="18"/>
+          <w:lang w:eastAsia="es-419"/>
+        </w:rPr>
+        <w:t xml:space="preserve">    |</w:t>
+      </w:r>
+      <w:r>
+        <w:rPr>
+          <w:rFonts w:ascii="Consolas" w:eastAsia="Times New Roman" w:hAnsi="Consolas" w:cs="Courier New"/>
+          <w:color w:val="171717"/>
+          <w:sz w:val="18"/>
+          <w:szCs w:val="18"/>
+          <w:lang w:eastAsia="es-419"/>
+        </w:rPr>
+        <w:t xml:space="preserve">                                                 </w:t>
+      </w:r>
+      <w:r>
+        <w:rPr>
+          <w:rFonts w:ascii="Consolas" w:eastAsia="Times New Roman" w:hAnsi="Consolas" w:cs="Courier New"/>
+          <w:color w:val="E5484D"/>
+          <w:sz w:val="18"/>
+          <w:szCs w:val="18"/>
+          <w:lang w:eastAsia="es-419"/>
+        </w:rPr>
+        <w:t>^</w:t>
+      </w:r>
+    </w:p>
+    <w:p>
+      <w:pPr>
+        <w:tabs>
+          <w:tab w:val="left" w:pos="916"/>
+          <w:tab w:val="left" w:pos="1832"/>
+          <w:tab w:val="left" w:pos="2748"/>
+          <w:tab w:val="left" w:pos="3664"/>
+          <w:tab w:val="left" w:pos="4580"/>
+          <w:tab w:val="left" w:pos="5496"/>
+          <w:tab w:val="left" w:pos="6412"/>
+          <w:tab w:val="left" w:pos="7328"/>
+          <w:tab w:val="left" w:pos="8244"/>
+          <w:tab w:val="left" w:pos="9160"/>
+          <w:tab w:val="left" w:pos="10076"/>
+          <w:tab w:val="left" w:pos="10992"/>
+          <w:tab w:val="left" w:pos="11908"/>
+          <w:tab w:val="left" w:pos="12824"/>
+          <w:tab w:val="left" w:pos="13740"/>
+          <w:tab w:val="left" w:pos="14656"/>
+        </w:tabs>
+        <w:spacing w:after="0" w:line="240" w:lineRule="atLeast"/>
+        <w:rPr>
+          <w:rFonts w:ascii="Consolas" w:eastAsia="Times New Roman" w:hAnsi="Consolas" w:cs="Courier New"/>
+          <w:color w:val="171717"/>
+          <w:sz w:val="18"/>
+          <w:szCs w:val="18"/>
+          <w:lang w:eastAsia="es-419"/>
+        </w:rPr>
+      </w:pPr>
+      <w:r>
+        <w:rPr>
+          <w:rFonts w:ascii="Consolas" w:eastAsia="Times New Roman" w:hAnsi="Consolas" w:cs="Courier New"/>
+          <w:color w:val="171717"/>
+          <w:sz w:val="18"/>
+          <w:szCs w:val="18"/>
+          <w:lang w:eastAsia="es-419"/>
+        </w:rPr>
+        <w:t xml:space="preserve"> </w:t>
+      </w:r>
+      <w:r>
+        <w:rPr>
+          <w:rFonts w:ascii="Consolas" w:eastAsia="Times New Roman" w:hAnsi="Consolas" w:cs="Courier New"/>
+          <w:color w:val="545454"/>
+          <w:sz w:val="18"/>
+          <w:szCs w:val="18"/>
+          <w:lang w:eastAsia="es-419"/>
+        </w:rPr>
+        <w:t xml:space="preserve"> 90 |</w:t>
+      </w:r>
+      <w:r>
+        <w:rPr>
+          <w:rFonts w:ascii="Consolas" w:eastAsia="Times New Roman" w:hAnsi="Consolas" w:cs="Courier New"/>
+          <w:color w:val="171717"/>
+          <w:sz w:val="18"/>
+          <w:szCs w:val="18"/>
+          <w:lang w:eastAsia="es-419"/>
+        </w:rPr>
+        <w:t xml:space="preserve">             inputProps</w:t>
+      </w:r>
+      <w:r>
+        <w:rPr>
+          <w:rFonts w:ascii="Consolas" w:eastAsia="Times New Roman" w:hAnsi="Consolas" w:cs="Courier New"/>
+          <w:color w:val="0054AD"/>
+          <w:sz w:val="18"/>
+          <w:szCs w:val="18"/>
+          <w:lang w:eastAsia="es-419"/>
+        </w:rPr>
+        <w:t>=</w:t>
+      </w:r>
+      <w:r>
+        <w:rPr>
+          <w:rFonts w:ascii="Consolas" w:eastAsia="Times New Roman" w:hAnsi="Consolas" w:cs="Courier New"/>
+          <w:color w:val="171717"/>
+          <w:sz w:val="18"/>
+          <w:szCs w:val="18"/>
+          <w:lang w:eastAsia="es-419"/>
+        </w:rPr>
+        <w:t>{{ id</w:t>
+      </w:r>
+      <w:r>
+        <w:rPr>
+          <w:rFonts w:ascii="Consolas" w:eastAsia="Times New Roman" w:hAnsi="Consolas" w:cs="Courier New"/>
+          <w:color w:val="0054AD"/>
+          <w:sz w:val="18"/>
+          <w:szCs w:val="18"/>
+          <w:lang w:eastAsia="es-419"/>
+        </w:rPr>
+        <w:t>:</w:t>
+      </w:r>
+      <w:r>
+        <w:rPr>
+          <w:rFonts w:ascii="Consolas" w:eastAsia="Times New Roman" w:hAnsi="Consolas" w:cs="Courier New"/>
+          <w:color w:val="171717"/>
+          <w:sz w:val="18"/>
+          <w:szCs w:val="18"/>
+          <w:lang w:eastAsia="es-419"/>
+        </w:rPr>
+        <w:t xml:space="preserve"> </w:t>
+      </w:r>
+      <w:r>
+        <w:rPr>
+          <w:rFonts w:ascii="Consolas" w:eastAsia="Times New Roman" w:hAnsi="Consolas" w:cs="Courier New"/>
+          <w:color w:val="036157"/>
+          <w:sz w:val="18"/>
+          <w:szCs w:val="18"/>
+          <w:lang w:eastAsia="es-419"/>
+        </w:rPr>
+        <w:t>'filter-sectionalFullName-select'</w:t>
+      </w:r>
+      <w:r>
+        <w:rPr>
+          <w:rFonts w:ascii="Consolas" w:eastAsia="Times New Roman" w:hAnsi="Consolas" w:cs="Courier New"/>
+          <w:color w:val="171717"/>
+          <w:sz w:val="18"/>
+          <w:szCs w:val="18"/>
+          <w:lang w:eastAsia="es-419"/>
+        </w:rPr>
+        <w:t xml:space="preserve"> }}</w:t>
+      </w:r>
+    </w:p>
+    <w:p>
+      <w:pPr>
+        <w:tabs>
+          <w:tab w:val="left" w:pos="916"/>
+          <w:tab w:val="left" w:pos="1832"/>
+          <w:tab w:val="left" w:pos="2748"/>
+          <w:tab w:val="left" w:pos="3664"/>
+          <w:tab w:val="left" w:pos="4580"/>
+          <w:tab w:val="left" w:pos="5496"/>
+          <w:tab w:val="left" w:pos="6412"/>
+          <w:tab w:val="left" w:pos="7328"/>
+          <w:tab w:val="left" w:pos="8244"/>
+          <w:tab w:val="left" w:pos="9160"/>
+          <w:tab w:val="left" w:pos="10076"/>
+          <w:tab w:val="left" w:pos="10992"/>
+          <w:tab w:val="left" w:pos="11908"/>
+          <w:tab w:val="left" w:pos="12824"/>
+          <w:tab w:val="left" w:pos="13740"/>
+          <w:tab w:val="left" w:pos="14656"/>
+        </w:tabs>
+        <w:spacing w:after="0" w:line="240" w:lineRule="atLeast"/>
+        <w:rPr>
+          <w:rFonts w:ascii="Consolas" w:eastAsia="Times New Roman" w:hAnsi="Consolas" w:cs="Courier New"/>
+          <w:color w:val="171717"/>
+          <w:sz w:val="18"/>
+          <w:szCs w:val="18"/>
+          <w:lang w:eastAsia="es-419"/>
+        </w:rPr>
+      </w:pPr>
+      <w:r>
+        <w:rPr>
+          <w:rFonts w:ascii="Consolas" w:eastAsia="Times New Roman" w:hAnsi="Consolas" w:cs="Courier New"/>
+          <w:color w:val="171717"/>
+          <w:sz w:val="18"/>
+          <w:szCs w:val="18"/>
+          <w:lang w:eastAsia="es-419"/>
+        </w:rPr>
+        <w:t xml:space="preserve"> </w:t>
+      </w:r>
+      <w:r>
+        <w:rPr>
+          <w:rFonts w:ascii="Consolas" w:eastAsia="Times New Roman" w:hAnsi="Consolas" w:cs="Courier New"/>
+          <w:color w:val="545454"/>
+          <w:sz w:val="18"/>
+          <w:szCs w:val="18"/>
+          <w:lang w:eastAsia="es-419"/>
+        </w:rPr>
+        <w:t xml:space="preserve"> 91 |</w:t>
+      </w:r>
+      <w:r>
+        <w:rPr>
+          <w:rFonts w:ascii="Consolas" w:eastAsia="Times New Roman" w:hAnsi="Consolas" w:cs="Courier New"/>
+          <w:color w:val="171717"/>
+          <w:sz w:val="18"/>
+          <w:szCs w:val="18"/>
+          <w:lang w:eastAsia="es-419"/>
+        </w:rPr>
+        <w:t xml:space="preserve">             </w:t>
+      </w:r>
+      <w:r>
+        <w:rPr>
+          <w:rFonts w:ascii="Consolas" w:eastAsia="Times New Roman" w:hAnsi="Consolas" w:cs="Courier New"/>
+          <w:color w:val="0054AD"/>
+          <w:sz w:val="18"/>
+          <w:szCs w:val="18"/>
+          <w:lang w:eastAsia="es-419"/>
+        </w:rPr>
+        <w:t>MenuProps=</w:t>
+      </w:r>
+      <w:r>
+        <w:rPr>
+          <w:rFonts w:ascii="Consolas" w:eastAsia="Times New Roman" w:hAnsi="Consolas" w:cs="Courier New"/>
+          <w:color w:val="171717"/>
+          <w:sz w:val="18"/>
+          <w:szCs w:val="18"/>
+          <w:lang w:eastAsia="es-419"/>
+        </w:rPr>
+        <w:t>{{</w:t>
+      </w:r>
+    </w:p>
+    <w:p>
+      <w:pPr>
+        <w:tabs>
+          <w:tab w:val="left" w:pos="916"/>
+          <w:tab w:val="left" w:pos="1832"/>
+          <w:tab w:val="left" w:pos="2748"/>
+          <w:tab w:val="left" w:pos="3664"/>
+          <w:tab w:val="left" w:pos="4580"/>
+          <w:tab w:val="left" w:pos="5496"/>
+          <w:tab w:val="left" w:pos="6412"/>
+          <w:tab w:val="left" w:pos="7328"/>
+          <w:tab w:val="left" w:pos="8244"/>
+          <w:tab w:val="left" w:pos="9160"/>
+          <w:tab w:val="left" w:pos="10076"/>
+          <w:tab w:val="left" w:pos="10992"/>
+          <w:tab w:val="left" w:pos="11908"/>
+          <w:tab w:val="left" w:pos="12824"/>
+          <w:tab w:val="left" w:pos="13740"/>
+          <w:tab w:val="left" w:pos="14656"/>
+        </w:tabs>
+        <w:spacing w:after="120" w:line="240" w:lineRule="atLeast"/>
+        <w:rPr>
+          <w:rFonts w:ascii="Consolas" w:eastAsia="Times New Roman" w:hAnsi="Consolas" w:cs="Courier New"/>
+          <w:color w:val="171717"/>
+          <w:sz w:val="18"/>
+          <w:szCs w:val="18"/>
+          <w:lang w:eastAsia="es-419"/>
+        </w:rPr>
+      </w:pPr>
+      <w:r>
+        <w:rPr>
+          <w:rFonts w:ascii="Consolas" w:eastAsia="Times New Roman" w:hAnsi="Consolas" w:cs="Courier New"/>
+          <w:color w:val="171717"/>
+          <w:sz w:val="18"/>
+          <w:szCs w:val="18"/>
+          <w:lang w:eastAsia="es-419"/>
+        </w:rPr>
+        <w:t xml:space="preserve"> </w:t>
+      </w:r>
+      <w:r>
+        <w:rPr>
+          <w:rFonts w:ascii="Consolas" w:eastAsia="Times New Roman" w:hAnsi="Consolas" w:cs="Courier New"/>
+          <w:color w:val="545454"/>
+          <w:sz w:val="18"/>
+          <w:szCs w:val="18"/>
+          <w:lang w:eastAsia="es-419"/>
+        </w:rPr>
+        <w:t xml:space="preserve"> 92 |</w:t>
+      </w:r>
+      <w:r>
+        <w:rPr>
+          <w:rFonts w:ascii="Consolas" w:eastAsia="Times New Roman" w:hAnsi="Consolas" w:cs="Courier New"/>
+          <w:color w:val="171717"/>
+          <w:sz w:val="18"/>
+          <w:szCs w:val="18"/>
+          <w:lang w:eastAsia="es-419"/>
+        </w:rPr>
+        <w:t xml:space="preserve">               slotProps</w:t>
+      </w:r>
+      <w:r>
+        <w:rPr>
+          <w:rFonts w:ascii="Consolas" w:eastAsia="Times New Roman" w:hAnsi="Consolas" w:cs="Courier New"/>
+          <w:color w:val="0054AD"/>
+          <w:sz w:val="18"/>
+          <w:szCs w:val="18"/>
+          <w:lang w:eastAsia="es-419"/>
+        </w:rPr>
+        <w:t>:</w:t>
+      </w:r>
+      <w:r>
+        <w:rPr>
+          <w:rFonts w:ascii="Consolas" w:eastAsia="Times New Roman" w:hAnsi="Consolas" w:cs="Courier New"/>
+          <w:color w:val="171717"/>
+          <w:sz w:val="18"/>
+          <w:szCs w:val="18"/>
+          <w:lang w:eastAsia="es-419"/>
+        </w:rPr>
+        <w:t xml:space="preserve"> { paper</w:t>
+      </w:r>
+      <w:r>
+        <w:rPr>
+          <w:rFonts w:ascii="Consolas" w:eastAsia="Times New Roman" w:hAnsi="Consolas" w:cs="Courier New"/>
+          <w:color w:val="0054AD"/>
+          <w:sz w:val="18"/>
+          <w:szCs w:val="18"/>
+          <w:lang w:eastAsia="es-419"/>
+        </w:rPr>
+        <w:t>:</w:t>
+      </w:r>
+      <w:r>
+        <w:rPr>
+          <w:rFonts w:ascii="Consolas" w:eastAsia="Times New Roman" w:hAnsi="Consolas" w:cs="Courier New"/>
+          <w:color w:val="171717"/>
+          <w:sz w:val="18"/>
+          <w:szCs w:val="18"/>
+          <w:lang w:eastAsia="es-419"/>
+        </w:rPr>
+        <w:t xml:space="preserve"> { sx</w:t>
+      </w:r>
+      <w:r>
+        <w:rPr>
+          <w:rFonts w:ascii="Consolas" w:eastAsia="Times New Roman" w:hAnsi="Consolas" w:cs="Courier New"/>
+          <w:color w:val="0054AD"/>
+          <w:sz w:val="18"/>
+          <w:szCs w:val="18"/>
+          <w:lang w:eastAsia="es-419"/>
+        </w:rPr>
+        <w:t>:</w:t>
+      </w:r>
+      <w:r>
+        <w:rPr>
+          <w:rFonts w:ascii="Consolas" w:eastAsia="Times New Roman" w:hAnsi="Consolas" w:cs="Courier New"/>
+          <w:color w:val="171717"/>
+          <w:sz w:val="18"/>
+          <w:szCs w:val="18"/>
+          <w:lang w:eastAsia="es-419"/>
+        </w:rPr>
+        <w:t xml:space="preserve"> { maxHeight</w:t>
+      </w:r>
+      <w:r>
+        <w:rPr>
+          <w:rFonts w:ascii="Consolas" w:eastAsia="Times New Roman" w:hAnsi="Consolas" w:cs="Courier New"/>
+          <w:color w:val="0054AD"/>
+          <w:sz w:val="18"/>
+          <w:szCs w:val="18"/>
+          <w:lang w:eastAsia="es-419"/>
+        </w:rPr>
+        <w:t>:</w:t>
+      </w:r>
+      <w:r>
+        <w:rPr>
+          <w:rFonts w:ascii="Consolas" w:eastAsia="Times New Roman" w:hAnsi="Consolas" w:cs="Courier New"/>
+          <w:color w:val="171717"/>
+          <w:sz w:val="18"/>
+          <w:szCs w:val="18"/>
+          <w:lang w:eastAsia="es-419"/>
+        </w:rPr>
+        <w:t xml:space="preserve"> </w:t>
+      </w:r>
+      <w:r>
+        <w:rPr>
+          <w:rFonts w:ascii="Consolas" w:eastAsia="Times New Roman" w:hAnsi="Consolas" w:cs="Courier New"/>
+          <w:color w:val="A51850"/>
+          <w:sz w:val="18"/>
+          <w:szCs w:val="18"/>
+          <w:lang w:eastAsia="es-419"/>
+        </w:rPr>
+        <w:t>250</w:t>
+      </w:r>
+      <w:r>
+        <w:rPr>
+          <w:rFonts w:ascii="Consolas" w:eastAsia="Times New Roman" w:hAnsi="Consolas" w:cs="Courier New"/>
+          <w:color w:val="171717"/>
+          <w:sz w:val="18"/>
+          <w:szCs w:val="18"/>
+          <w:lang w:eastAsia="es-419"/>
+        </w:rPr>
+        <w:t xml:space="preserve"> } } }</w:t>
+      </w:r>
+      <w:r>
+        <w:rPr>
+          <w:rFonts w:ascii="Consolas" w:eastAsia="Times New Roman" w:hAnsi="Consolas" w:cs="Courier New"/>
+          <w:color w:val="0054AD"/>
+          <w:sz w:val="18"/>
+          <w:szCs w:val="18"/>
+          <w:lang w:eastAsia="es-419"/>
+        </w:rPr>
+        <w:t>,</w:t>
+      </w:r>
+    </w:p>
+    <w:p>
+      <w:pPr>
+        <w:shd w:val="clear" w:color="auto" w:fill="FFFFFF"/>
+        <w:spacing w:after="0" w:line="240" w:lineRule="auto"/>
+        <w:rPr>
+          <w:rFonts w:ascii="Source Sans Pro" w:eastAsia="Times New Roman" w:hAnsi="Source Sans Pro" w:cs="Times New Roman"/>
+          <w:color w:val="171717"/>
+          <w:sz w:val="24"/>
+          <w:szCs w:val="24"/>
+          <w:lang w:eastAsia="es-419"/>
+        </w:rPr>
+      </w:pPr>
+      <w:r>
+        <w:rPr>
+          <w:rFonts w:ascii="Source Sans Pro" w:eastAsia="Times New Roman" w:hAnsi="Source Sans Pro" w:cs="Times New Roman"/>
+          <w:color w:val="171717"/>
+          <w:sz w:val="24"/>
+          <w:szCs w:val="24"/>
+          <w:lang w:eastAsia="es-419"/>
+        </w:rPr>
+        <w:t>Call Stack</w:t>
+      </w:r>
+      <w:r>
+        <w:rPr>
+          <w:rFonts w:ascii="Source Sans Pro" w:eastAsia="Times New Roman" w:hAnsi="Source Sans Pro" w:cs="Times New Roman"/>
+          <w:color w:val="171717"/>
+          <w:sz w:val="17"/>
+          <w:szCs w:val="17"/>
+          <w:lang w:eastAsia="es-419"/>
+        </w:rPr>
+        <w:t>29</w:t>
+      </w:r>
+    </w:p>
+    <w:p>
+      <w:pPr>
+        <w:shd w:val="clear" w:color="auto" w:fill="FFFFFF"/>
+        <w:spacing w:after="0" w:line="240" w:lineRule="auto"/>
+        <w:rPr>
+          <w:rFonts w:ascii="Source Sans Pro" w:eastAsia="Times New Roman" w:hAnsi="Source Sans Pro" w:cs="Times New Roman"/>
+          <w:color w:val="757575"/>
+          <w:sz w:val="24"/>
+          <w:szCs w:val="24"/>
+          <w:lang w:eastAsia="es-419"/>
+        </w:rPr>
+      </w:pPr>
+      <w:r>
+        <w:rPr>
+          <w:rFonts w:ascii="Source Sans Pro" w:eastAsia="Times New Roman" w:hAnsi="Source Sans Pro" w:cs="Times New Roman"/>
+          <w:color w:val="757575"/>
+          <w:sz w:val="24"/>
+          <w:szCs w:val="24"/>
+          <w:lang w:eastAsia="es-419"/>
+        </w:rPr>
+        <w:t>Show 25 ignore-listed frame(s)</w:t>
+      </w:r>
+    </w:p>
+    <w:p>
+      <w:pPr>
+        <w:shd w:val="clear" w:color="auto" w:fill="FFFFFF"/>
+        <w:spacing w:after="60" w:line="300" w:lineRule="atLeast"/>
+        <w:rPr>
+          <w:rFonts w:ascii="Consolas" w:eastAsia="Times New Roman" w:hAnsi="Consolas" w:cs="Times New Roman"/>
+          <w:color w:val="171717"/>
+          <w:sz w:val="21"/>
+          <w:szCs w:val="21"/>
+          <w:lang w:eastAsia="es-419"/>
+        </w:rPr>
+      </w:pPr>
+      <w:r>
+        <w:rPr>
+          <w:rFonts w:ascii="Consolas" w:eastAsia="Times New Roman" w:hAnsi="Consolas" w:cs="Times New Roman"/>
+          <w:color w:val="171717"/>
+          <w:sz w:val="21"/>
+          <w:szCs w:val="21"/>
+          <w:lang w:eastAsia="es-419"/>
+        </w:rPr>
+        <w:t>renderValue</w:t>
+      </w:r>
+    </w:p>
+    <w:p>
+      <w:pPr>
+        <w:shd w:val="clear" w:color="auto" w:fill="FFFFFF"/>
+        <w:spacing w:after="60" w:line="240" w:lineRule="auto"/>
+        <w:rPr>
+          <w:rFonts w:ascii="Source Sans Pro" w:eastAsia="Times New Roman" w:hAnsi="Source Sans Pro" w:cs="Times New Roman"/>
+          <w:color w:val="757575"/>
+          <w:sz w:val="24"/>
+          <w:szCs w:val="24"/>
+          <w:lang w:eastAsia="es-419"/>
+        </w:rPr>
+      </w:pPr>
+      <w:r>
+        <w:rPr>
+          <w:rFonts w:ascii="Source Sans Pro" w:eastAsia="Times New Roman" w:hAnsi="Source Sans Pro" w:cs="Times New Roman"/>
+          <w:color w:val="666666"/>
+          <w:sz w:val="21"/>
+          <w:szCs w:val="21"/>
+          <w:lang w:eastAsia="es-419"/>
+        </w:rPr>
+        <w:t>src/sections/dest/dest-table-toolbar.jsx (89:49)</w:t>
+      </w:r>
+    </w:p>
+    <w:p>
+      <w:pPr>
+        <w:shd w:val="clear" w:color="auto" w:fill="FFFFFF"/>
+        <w:spacing w:after="60" w:line="300" w:lineRule="atLeast"/>
+        <w:rPr>
+          <w:rFonts w:ascii="Consolas" w:eastAsia="Times New Roman" w:hAnsi="Consolas" w:cs="Times New Roman"/>
+          <w:color w:val="171717"/>
+          <w:sz w:val="21"/>
+          <w:szCs w:val="21"/>
+          <w:lang w:eastAsia="es-419"/>
+        </w:rPr>
+      </w:pPr>
+      <w:r>
+        <w:rPr>
+          <w:rFonts w:ascii="Consolas" w:eastAsia="Times New Roman" w:hAnsi="Consolas" w:cs="Times New Roman"/>
+          <w:color w:val="171717"/>
+          <w:sz w:val="21"/>
+          <w:szCs w:val="21"/>
+          <w:lang w:eastAsia="es-419"/>
+        </w:rPr>
+        <w:t>DestTableToolbar</w:t>
+      </w:r>
+    </w:p>
+    <w:p>
+      <w:pPr>
+        <w:shd w:val="clear" w:color="auto" w:fill="FFFFFF"/>
+        <w:spacing w:after="60" w:line="240" w:lineRule="auto"/>
+        <w:rPr>
+          <w:rFonts w:ascii="Source Sans Pro" w:eastAsia="Times New Roman" w:hAnsi="Source Sans Pro" w:cs="Times New Roman"/>
+          <w:color w:val="757575"/>
+          <w:sz w:val="24"/>
+          <w:szCs w:val="24"/>
+          <w:lang w:eastAsia="es-419"/>
+        </w:rPr>
+      </w:pPr>
+      <w:r>
+        <w:rPr>
+          <w:rFonts w:ascii="Source Sans Pro" w:eastAsia="Times New Roman" w:hAnsi="Source Sans Pro" w:cs="Times New Roman"/>
+          <w:color w:val="666666"/>
+          <w:sz w:val="21"/>
+          <w:szCs w:val="21"/>
+          <w:lang w:eastAsia="es-419"/>
+        </w:rPr>
+        <w:t>src/sections/dest/dest-table-toolbar.jsx (84:11)</w:t>
+      </w:r>
+    </w:p>
+    <w:p>
+      <w:pPr>
+        <w:shd w:val="clear" w:color="auto" w:fill="FFFFFF"/>
+        <w:spacing w:after="60" w:line="300" w:lineRule="atLeast"/>
+        <w:rPr>
+          <w:rFonts w:ascii="Consolas" w:eastAsia="Times New Roman" w:hAnsi="Consolas" w:cs="Times New Roman"/>
+          <w:color w:val="171717"/>
+          <w:sz w:val="21"/>
+          <w:szCs w:val="21"/>
+          <w:lang w:eastAsia="es-419"/>
+        </w:rPr>
+      </w:pPr>
+      <w:r>
+        <w:rPr>
+          <w:rFonts w:ascii="Consolas" w:eastAsia="Times New Roman" w:hAnsi="Consolas" w:cs="Times New Roman"/>
+          <w:color w:val="171717"/>
+          <w:sz w:val="21"/>
+          <w:szCs w:val="21"/>
+          <w:lang w:eastAsia="es-419"/>
+        </w:rPr>
+        <w:t>DestListView</w:t>
+      </w:r>
+    </w:p>
+    <w:p>
+      <w:pPr>
+        <w:shd w:val="clear" w:color="auto" w:fill="FFFFFF"/>
+        <w:spacing w:after="60" w:line="240" w:lineRule="auto"/>
+        <w:rPr>
+          <w:rFonts w:ascii="Source Sans Pro" w:eastAsia="Times New Roman" w:hAnsi="Source Sans Pro" w:cs="Times New Roman"/>
+          <w:color w:val="757575"/>
+          <w:sz w:val="24"/>
+          <w:szCs w:val="24"/>
+          <w:lang w:eastAsia="es-419"/>
+        </w:rPr>
+      </w:pPr>
+      <w:r>
+        <w:rPr>
+          <w:rFonts w:ascii="Source Sans Pro" w:eastAsia="Times New Roman" w:hAnsi="Source Sans Pro" w:cs="Times New Roman"/>
+          <w:color w:val="666666"/>
+          <w:sz w:val="21"/>
+          <w:szCs w:val="21"/>
+          <w:lang w:eastAsia="es-419"/>
+        </w:rPr>
+        <w:t>src/sections/dest/view/dest-list-view.jsx (230:11)</w:t>
+      </w:r>
+    </w:p>
+    <w:p>
+      <w:pPr>
+        <w:shd w:val="clear" w:color="auto" w:fill="FFFFFF"/>
+        <w:spacing w:after="60" w:line="300" w:lineRule="atLeast"/>
+        <w:rPr>
+          <w:rFonts w:ascii="Consolas" w:eastAsia="Times New Roman" w:hAnsi="Consolas" w:cs="Times New Roman"/>
+          <w:color w:val="171717"/>
+          <w:sz w:val="21"/>
+          <w:szCs w:val="21"/>
+          <w:lang w:eastAsia="es-419"/>
+        </w:rPr>
+      </w:pPr>
+      <w:r>
+        <w:rPr>
+          <w:rFonts w:ascii="Consolas" w:eastAsia="Times New Roman" w:hAnsi="Consolas" w:cs="Times New Roman"/>
+          <w:color w:val="171717"/>
+          <w:sz w:val="21"/>
+          <w:szCs w:val="21"/>
+          <w:lang w:eastAsia="es-419"/>
+        </w:rPr>
+        <w:t>Page</w:t>
+      </w:r>
+    </w:p>
+    <w:p>
+      <w:pPr>
+        <w:shd w:val="clear" w:color="auto" w:fill="FFFFFF"/>
+        <w:spacing w:after="0" w:line="240" w:lineRule="auto"/>
+        <w:rPr>
+          <w:rFonts w:ascii="Source Sans Pro" w:eastAsia="Times New Roman" w:hAnsi="Source Sans Pro" w:cs="Times New Roman"/>
+          <w:color w:val="757575"/>
+          <w:sz w:val="24"/>
+          <w:szCs w:val="24"/>
+          <w:lang w:eastAsia="es-419"/>
+        </w:rPr>
+      </w:pPr>
+      <w:r>
+        <w:rPr>
+          <w:rFonts w:ascii="Source Sans Pro" w:eastAsia="Times New Roman" w:hAnsi="Source Sans Pro" w:cs="Times New Roman"/>
+          <w:color w:val="666666"/>
+          <w:sz w:val="21"/>
+          <w:szCs w:val="21"/>
+          <w:lang w:eastAsia="es-419"/>
+        </w:rPr>
+        <w:t>src\app\dashboard\level\dest\page.jsx (11:10)</w:t>
+      </w:r>
+    </w:p>
+    <w:p/>
+    <w:p>
+      <w:pPr>
+        <w:rPr>
+          <w:lang w:val="es-419"/>
+        </w:rPr>
+      </w:pPr>
+      <w:r>
+        <w:rPr>
+          <w:lang w:val="es-419"/>
+        </w:rPr>
+        <w:t>en list-view</w:t>
+      </w:r>
+      <w:r>
+        <w:rPr>
+          <w:lang w:val="es-419"/>
+        </w:rPr>
+        <w:t xml:space="preserve"> </w:t>
+      </w:r>
+      <w:r>
+        <w:rPr>
+          <w:lang w:val="es-419"/>
+        </w:rPr>
+        <w:t>cambiar de</w:t>
+      </w:r>
+      <w:r>
+        <w:rPr>
+          <w:lang w:val="es-419"/>
+        </w:rPr>
+        <w:t>:</w:t>
+      </w:r>
+    </w:p>
+    <w:p>
+      <w:pPr>
+        <w:shd w:val="clear" w:color="auto" w:fill="24283B"/>
+        <w:spacing w:after="0" w:line="285" w:lineRule="atLeast"/>
+        <w:rPr>
+          <w:rFonts w:ascii="Consolas" w:eastAsia="Times New Roman" w:hAnsi="Consolas" w:cs="Times New Roman"/>
+          <w:color w:val="A9B1D6"/>
+          <w:sz w:val="21"/>
+          <w:szCs w:val="21"/>
+          <w:lang w:val="es-419" w:eastAsia="es-419"/>
+        </w:rPr>
+      </w:pPr>
+      <w:r>
+        <w:rPr>
+          <w:rFonts w:ascii="Consolas" w:eastAsia="Times New Roman" w:hAnsi="Consolas" w:cs="Times New Roman"/>
+          <w:color w:val="9ABDF5"/>
+          <w:sz w:val="21"/>
+          <w:szCs w:val="21"/>
+          <w:lang w:val="es-419" w:eastAsia="es-419"/>
+        </w:rPr>
+        <w:t xml:space="preserve">    </w:t>
+      </w:r>
+      <w:r>
+        <w:rPr>
+          <w:rFonts w:ascii="Consolas" w:eastAsia="Times New Roman" w:hAnsi="Consolas" w:cs="Times New Roman"/>
+          <w:color w:val="7AA2F7"/>
+          <w:sz w:val="21"/>
+          <w:szCs w:val="21"/>
+          <w:lang w:val="es-419" w:eastAsia="es-419"/>
+        </w:rPr>
+        <w:t>updateFilters</w:t>
+      </w:r>
+      <w:r>
+        <w:rPr>
+          <w:rFonts w:ascii="Consolas" w:eastAsia="Times New Roman" w:hAnsi="Consolas" w:cs="Times New Roman"/>
+          <w:color w:val="9ABDF5"/>
+          <w:sz w:val="21"/>
+          <w:szCs w:val="21"/>
+          <w:lang w:val="es-419" w:eastAsia="es-419"/>
+        </w:rPr>
+        <w:t xml:space="preserve">({ </w:t>
+      </w:r>
+      <w:r>
+        <w:rPr>
+          <w:rFonts w:ascii="Consolas" w:eastAsia="Times New Roman" w:hAnsi="Consolas" w:cs="Times New Roman"/>
+          <w:color w:val="73DACA"/>
+          <w:sz w:val="21"/>
+          <w:szCs w:val="21"/>
+          <w:lang w:val="es-419" w:eastAsia="es-419"/>
+        </w:rPr>
+        <w:t>sectionalFullName</w:t>
+      </w:r>
+      <w:r>
+        <w:rPr>
+          <w:rFonts w:ascii="Consolas" w:eastAsia="Times New Roman" w:hAnsi="Consolas" w:cs="Times New Roman"/>
+          <w:color w:val="89DDFF"/>
+          <w:sz w:val="21"/>
+          <w:szCs w:val="21"/>
+          <w:lang w:val="es-419" w:eastAsia="es-419"/>
+        </w:rPr>
+        <w:t>:</w:t>
+      </w:r>
+      <w:r>
+        <w:rPr>
+          <w:rFonts w:ascii="Consolas" w:eastAsia="Times New Roman" w:hAnsi="Consolas" w:cs="Times New Roman"/>
+          <w:color w:val="9ABDF5"/>
+          <w:sz w:val="21"/>
+          <w:szCs w:val="21"/>
+          <w:lang w:val="es-419" w:eastAsia="es-419"/>
+        </w:rPr>
+        <w:t xml:space="preserve"> </w:t>
+      </w:r>
+      <w:r>
+        <w:rPr>
+          <w:rFonts w:ascii="Consolas" w:eastAsia="Times New Roman" w:hAnsi="Consolas" w:cs="Times New Roman"/>
+          <w:color w:val="C0CAF5"/>
+          <w:sz w:val="21"/>
+          <w:szCs w:val="21"/>
+          <w:lang w:val="es-419" w:eastAsia="es-419"/>
+        </w:rPr>
+        <w:t>sectionalFromUrl</w:t>
+      </w:r>
+      <w:r>
+        <w:rPr>
+          <w:rFonts w:ascii="Consolas" w:eastAsia="Times New Roman" w:hAnsi="Consolas" w:cs="Times New Roman"/>
+          <w:color w:val="9ABDF5"/>
+          <w:sz w:val="21"/>
+          <w:szCs w:val="21"/>
+          <w:lang w:val="es-419" w:eastAsia="es-419"/>
+        </w:rPr>
+        <w:t xml:space="preserve"> })</w:t>
+      </w:r>
+      <w:r>
+        <w:rPr>
+          <w:rFonts w:ascii="Consolas" w:eastAsia="Times New Roman" w:hAnsi="Consolas" w:cs="Times New Roman"/>
+          <w:color w:val="89DDFF"/>
+          <w:sz w:val="21"/>
+          <w:szCs w:val="21"/>
+          <w:lang w:val="es-419" w:eastAsia="es-419"/>
+        </w:rPr>
+        <w:t>;</w:t>
+      </w:r>
+    </w:p>
+    <w:p>
+      <w:pPr>
+        <w:rPr>
+          <w:lang w:val="es-419"/>
+        </w:rPr>
+      </w:pPr>
+    </w:p>
+    <w:p>
+      <w:pPr>
+        <w:rPr>
+          <w:lang w:val="es-419"/>
+        </w:rPr>
+      </w:pPr>
+      <w:r>
+        <w:rPr>
+          <w:lang w:val="es-419"/>
+        </w:rPr>
+        <w:t>a</w:t>
+      </w:r>
+    </w:p>
+    <w:p>
+      <w:pPr>
+        <w:shd w:val="clear" w:color="auto" w:fill="24283B"/>
+        <w:spacing w:after="0" w:line="285" w:lineRule="atLeast"/>
+        <w:rPr>
+          <w:rFonts w:ascii="Consolas" w:eastAsia="Times New Roman" w:hAnsi="Consolas" w:cs="Times New Roman"/>
+          <w:color w:val="A9B1D6"/>
+          <w:sz w:val="21"/>
+          <w:szCs w:val="21"/>
+          <w:lang w:eastAsia="es-419"/>
+        </w:rPr>
+      </w:pPr>
+      <w:r>
+        <w:rPr>
+          <w:rFonts w:ascii="Consolas" w:eastAsia="Times New Roman" w:hAnsi="Consolas" w:cs="Times New Roman"/>
+          <w:color w:val="9ABDF5"/>
+          <w:sz w:val="21"/>
+          <w:szCs w:val="21"/>
+          <w:lang w:eastAsia="es-419"/>
+        </w:rPr>
+        <w:t xml:space="preserve">    </w:t>
+      </w:r>
+      <w:r>
+        <w:rPr>
+          <w:rFonts w:ascii="Consolas" w:eastAsia="Times New Roman" w:hAnsi="Consolas" w:cs="Times New Roman"/>
+          <w:color w:val="7AA2F7"/>
+          <w:sz w:val="21"/>
+          <w:szCs w:val="21"/>
+          <w:lang w:eastAsia="es-419"/>
+        </w:rPr>
+        <w:t>updateFilters</w:t>
+      </w:r>
+      <w:r>
+        <w:rPr>
+          <w:rFonts w:ascii="Consolas" w:eastAsia="Times New Roman" w:hAnsi="Consolas" w:cs="Times New Roman"/>
+          <w:color w:val="9ABDF5"/>
+          <w:sz w:val="21"/>
+          <w:szCs w:val="21"/>
+          <w:lang w:eastAsia="es-419"/>
+        </w:rPr>
+        <w:t xml:space="preserve">({ </w:t>
+      </w:r>
+      <w:r>
+        <w:rPr>
+          <w:rFonts w:ascii="Consolas" w:eastAsia="Times New Roman" w:hAnsi="Consolas" w:cs="Times New Roman"/>
+          <w:color w:val="73DACA"/>
+          <w:sz w:val="21"/>
+          <w:szCs w:val="21"/>
+          <w:lang w:eastAsia="es-419"/>
+        </w:rPr>
+        <w:t>sectionalFullName</w:t>
+      </w:r>
+      <w:r>
+        <w:rPr>
+          <w:rFonts w:ascii="Consolas" w:eastAsia="Times New Roman" w:hAnsi="Consolas" w:cs="Times New Roman"/>
+          <w:color w:val="89DDFF"/>
+          <w:sz w:val="21"/>
+          <w:szCs w:val="21"/>
+          <w:lang w:eastAsia="es-419"/>
+        </w:rPr>
+        <w:t>:</w:t>
+      </w:r>
+      <w:r>
+        <w:rPr>
+          <w:rFonts w:ascii="Consolas" w:eastAsia="Times New Roman" w:hAnsi="Consolas" w:cs="Times New Roman"/>
+          <w:color w:val="9ABDF5"/>
+          <w:sz w:val="21"/>
+          <w:szCs w:val="21"/>
+          <w:lang w:eastAsia="es-419"/>
+        </w:rPr>
+        <w:t xml:space="preserve"> </w:t>
+      </w:r>
+      <w:r>
+        <w:rPr>
+          <w:rFonts w:ascii="Consolas" w:eastAsia="Times New Roman" w:hAnsi="Consolas" w:cs="Times New Roman"/>
+          <w:color w:val="9ABDF5"/>
+          <w:sz w:val="21"/>
+          <w:szCs w:val="21"/>
+          <w:highlight w:val="yellow"/>
+          <w:lang w:eastAsia="es-419"/>
+        </w:rPr>
+        <w:t>[</w:t>
+      </w:r>
+      <w:r>
+        <w:rPr>
+          <w:rFonts w:ascii="Consolas" w:eastAsia="Times New Roman" w:hAnsi="Consolas" w:cs="Times New Roman"/>
+          <w:color w:val="7DCFFF"/>
+          <w:sz w:val="21"/>
+          <w:szCs w:val="21"/>
+          <w:lang w:eastAsia="es-419"/>
+        </w:rPr>
+        <w:t>sectionalFromUrl</w:t>
+      </w:r>
+      <w:r>
+        <w:rPr>
+          <w:rFonts w:ascii="Consolas" w:eastAsia="Times New Roman" w:hAnsi="Consolas" w:cs="Times New Roman"/>
+          <w:color w:val="9ABDF5"/>
+          <w:sz w:val="21"/>
+          <w:szCs w:val="21"/>
+          <w:highlight w:val="yellow"/>
+          <w:lang w:eastAsia="es-419"/>
+        </w:rPr>
+        <w:t>]</w:t>
+      </w:r>
+      <w:r>
+        <w:rPr>
+          <w:rFonts w:ascii="Consolas" w:eastAsia="Times New Roman" w:hAnsi="Consolas" w:cs="Times New Roman"/>
+          <w:color w:val="9ABDF5"/>
+          <w:sz w:val="21"/>
+          <w:szCs w:val="21"/>
+          <w:lang w:eastAsia="es-419"/>
+        </w:rPr>
+        <w:t xml:space="preserve"> })</w:t>
+      </w:r>
+      <w:r>
+        <w:rPr>
+          <w:rFonts w:ascii="Consolas" w:eastAsia="Times New Roman" w:hAnsi="Consolas" w:cs="Times New Roman"/>
+          <w:color w:val="89DDFF"/>
+          <w:sz w:val="21"/>
+          <w:szCs w:val="21"/>
+          <w:lang w:eastAsia="es-419"/>
+        </w:rPr>
+        <w:t>;</w:t>
+      </w:r>
+    </w:p>
+    <w:p>
+      <w:pPr>
+        <w:rPr>
+          <w:lang w:val="es-419"/>
+        </w:rPr>
+      </w:pPr>
+      <w:r>
+        <w:rPr>
+          <w:lang w:val="es-419"/>
+        </w:rPr>
+        <w:t>Esto sucede porque el desplegable e</w:t>
+      </w:r>
+      <w:r>
+        <w:rPr>
+          <w:lang w:val="es-419"/>
+        </w:rPr>
+        <w:t>s arra</w:t>
+      </w:r>
+      <w:r>
+        <w:rPr>
+          <w:lang w:val="es-419"/>
+        </w:rPr>
+        <w:t>y</w:t>
+      </w:r>
+      <w:r>
+        <w:rPr>
+          <w:lang w:val="es-419"/>
+        </w:rPr>
+        <w:t xml:space="preserve"> [ ]</w:t>
+      </w:r>
+    </w:p>
+    <w:p>
+      <w:pPr>
+        <w:rPr>
+          <w:lang w:val="es-419"/>
+        </w:rPr>
+      </w:pPr>
+      <w:r>
+        <w:rPr>
+          <w:lang w:val="es-419"/>
+        </w:rPr>
+        <w:br w:type="page"/>
+      </w:r>
+    </w:p>
+    <w:p>
+      <w:pPr>
+        <w:rPr>
+          <w:lang w:val="es-419"/>
+        </w:rPr>
+      </w:pPr>
+      <w:r>
+        <w:rPr>
+          <w:lang w:val="es-419"/>
+        </w:rPr>
+        <w:lastRenderedPageBreak/>
+        <w:t>Si se necesita escribir en la barra de búsqueda se utiliza el list view de donde quieres agregarlo:</w:t>
+      </w:r>
+    </w:p>
+    <w:p>
+      <w:pPr>
+        <w:shd w:val="clear" w:color="auto" w:fill="24283B"/>
+        <w:spacing w:after="0" w:line="285" w:lineRule="atLeast"/>
+        <w:rPr>
+          <w:rFonts w:ascii="Consolas" w:eastAsia="Times New Roman" w:hAnsi="Consolas" w:cs="Times New Roman"/>
+          <w:color w:val="A9B1D6"/>
+          <w:sz w:val="21"/>
+          <w:szCs w:val="21"/>
+          <w:lang w:eastAsia="es-419"/>
+        </w:rPr>
+      </w:pPr>
+      <w:r>
+        <w:rPr>
+          <w:rFonts w:ascii="Consolas" w:eastAsia="Times New Roman" w:hAnsi="Consolas" w:cs="Times New Roman"/>
+          <w:i/>
+          <w:iCs/>
+          <w:color w:val="9D7CD8"/>
+          <w:sz w:val="21"/>
+          <w:szCs w:val="21"/>
+          <w:lang w:eastAsia="es-419"/>
+        </w:rPr>
+        <w:t>const</w:t>
+      </w:r>
+      <w:r>
+        <w:rPr>
+          <w:rFonts w:ascii="Consolas" w:eastAsia="Times New Roman" w:hAnsi="Consolas" w:cs="Times New Roman"/>
+          <w:color w:val="9ABDF5"/>
+          <w:sz w:val="21"/>
+          <w:szCs w:val="21"/>
+          <w:lang w:eastAsia="es-419"/>
+        </w:rPr>
+        <w:t xml:space="preserve"> </w:t>
+      </w:r>
+      <w:r>
+        <w:rPr>
+          <w:rFonts w:ascii="Consolas" w:eastAsia="Times New Roman" w:hAnsi="Consolas" w:cs="Times New Roman"/>
+          <w:color w:val="BB9AF7"/>
+          <w:sz w:val="21"/>
+          <w:szCs w:val="21"/>
+          <w:lang w:eastAsia="es-419"/>
+        </w:rPr>
+        <w:t>searchParams</w:t>
+      </w:r>
+      <w:r>
+        <w:rPr>
+          <w:rFonts w:ascii="Consolas" w:eastAsia="Times New Roman" w:hAnsi="Consolas" w:cs="Times New Roman"/>
+          <w:color w:val="9ABDF5"/>
+          <w:sz w:val="21"/>
+          <w:szCs w:val="21"/>
+          <w:lang w:eastAsia="es-419"/>
+        </w:rPr>
+        <w:t xml:space="preserve"> </w:t>
+      </w:r>
+      <w:r>
+        <w:rPr>
+          <w:rFonts w:ascii="Consolas" w:eastAsia="Times New Roman" w:hAnsi="Consolas" w:cs="Times New Roman"/>
+          <w:color w:val="89DDFF"/>
+          <w:sz w:val="21"/>
+          <w:szCs w:val="21"/>
+          <w:lang w:eastAsia="es-419"/>
+        </w:rPr>
+        <w:t>=</w:t>
+      </w:r>
+      <w:r>
+        <w:rPr>
+          <w:rFonts w:ascii="Consolas" w:eastAsia="Times New Roman" w:hAnsi="Consolas" w:cs="Times New Roman"/>
+          <w:color w:val="9ABDF5"/>
+          <w:sz w:val="21"/>
+          <w:szCs w:val="21"/>
+          <w:lang w:eastAsia="es-419"/>
+        </w:rPr>
+        <w:t xml:space="preserve"> </w:t>
+      </w:r>
+      <w:r>
+        <w:rPr>
+          <w:rFonts w:ascii="Consolas" w:eastAsia="Times New Roman" w:hAnsi="Consolas" w:cs="Times New Roman"/>
+          <w:color w:val="7AA2F7"/>
+          <w:sz w:val="21"/>
+          <w:szCs w:val="21"/>
+          <w:lang w:eastAsia="es-419"/>
+        </w:rPr>
+        <w:t>useSearchParams</w:t>
+      </w:r>
+      <w:r>
+        <w:rPr>
+          <w:rFonts w:ascii="Consolas" w:eastAsia="Times New Roman" w:hAnsi="Consolas" w:cs="Times New Roman"/>
+          <w:color w:val="9ABDF5"/>
+          <w:sz w:val="21"/>
+          <w:szCs w:val="21"/>
+          <w:lang w:eastAsia="es-419"/>
+        </w:rPr>
+        <w:t>()</w:t>
+      </w:r>
+      <w:r>
+        <w:rPr>
+          <w:rFonts w:ascii="Consolas" w:eastAsia="Times New Roman" w:hAnsi="Consolas" w:cs="Times New Roman"/>
+          <w:color w:val="89DDFF"/>
+          <w:sz w:val="21"/>
+          <w:szCs w:val="21"/>
+          <w:lang w:eastAsia="es-419"/>
+        </w:rPr>
+        <w:t>;</w:t>
+      </w:r>
+    </w:p>
+    <w:p>
+      <w:pPr>
+        <w:shd w:val="clear" w:color="auto" w:fill="24283B"/>
+        <w:spacing w:after="0" w:line="285" w:lineRule="atLeast"/>
+        <w:rPr>
+          <w:rFonts w:ascii="Consolas" w:eastAsia="Times New Roman" w:hAnsi="Consolas" w:cs="Times New Roman"/>
+          <w:color w:val="A9B1D6"/>
+          <w:sz w:val="21"/>
+          <w:szCs w:val="21"/>
+          <w:lang w:eastAsia="es-419"/>
+        </w:rPr>
+      </w:pPr>
+      <w:r>
+        <w:rPr>
+          <w:rFonts w:ascii="Consolas" w:eastAsia="Times New Roman" w:hAnsi="Consolas" w:cs="Times New Roman"/>
+          <w:color w:val="9ABDF5"/>
+          <w:sz w:val="21"/>
+          <w:szCs w:val="21"/>
+          <w:lang w:eastAsia="es-419"/>
+        </w:rPr>
+        <w:t xml:space="preserve">  </w:t>
+      </w:r>
+      <w:r>
+        <w:rPr>
+          <w:rFonts w:ascii="Consolas" w:eastAsia="Times New Roman" w:hAnsi="Consolas" w:cs="Times New Roman"/>
+          <w:i/>
+          <w:iCs/>
+          <w:color w:val="9D7CD8"/>
+          <w:sz w:val="21"/>
+          <w:szCs w:val="21"/>
+          <w:highlight w:val="darkGreen"/>
+          <w:lang w:eastAsia="es-419"/>
+        </w:rPr>
+        <w:t>const</w:t>
+      </w:r>
+      <w:r>
+        <w:rPr>
+          <w:rFonts w:ascii="Consolas" w:eastAsia="Times New Roman" w:hAnsi="Consolas" w:cs="Times New Roman"/>
+          <w:color w:val="9ABDF5"/>
+          <w:sz w:val="21"/>
+          <w:szCs w:val="21"/>
+          <w:highlight w:val="darkGreen"/>
+          <w:lang w:eastAsia="es-419"/>
+        </w:rPr>
+        <w:t xml:space="preserve"> </w:t>
+      </w:r>
+      <w:r>
+        <w:rPr>
+          <w:rFonts w:ascii="Consolas" w:eastAsia="Times New Roman" w:hAnsi="Consolas" w:cs="Times New Roman"/>
+          <w:color w:val="BB9AF7"/>
+          <w:sz w:val="21"/>
+          <w:szCs w:val="21"/>
+          <w:highlight w:val="darkGreen"/>
+          <w:lang w:eastAsia="es-419"/>
+        </w:rPr>
+        <w:t>sectionFromUrl</w:t>
+      </w:r>
+      <w:r>
+        <w:rPr>
+          <w:rFonts w:ascii="Consolas" w:eastAsia="Times New Roman" w:hAnsi="Consolas" w:cs="Times New Roman"/>
+          <w:color w:val="9ABDF5"/>
+          <w:sz w:val="21"/>
+          <w:szCs w:val="21"/>
+          <w:highlight w:val="darkGreen"/>
+          <w:lang w:eastAsia="es-419"/>
+        </w:rPr>
+        <w:t xml:space="preserve"> </w:t>
+      </w:r>
+      <w:r>
+        <w:rPr>
+          <w:rFonts w:ascii="Consolas" w:eastAsia="Times New Roman" w:hAnsi="Consolas" w:cs="Times New Roman"/>
+          <w:color w:val="89DDFF"/>
+          <w:sz w:val="21"/>
+          <w:szCs w:val="21"/>
+          <w:highlight w:val="darkGreen"/>
+          <w:lang w:eastAsia="es-419"/>
+        </w:rPr>
+        <w:t>=</w:t>
+      </w:r>
+      <w:r>
+        <w:rPr>
+          <w:rFonts w:ascii="Consolas" w:eastAsia="Times New Roman" w:hAnsi="Consolas" w:cs="Times New Roman"/>
+          <w:color w:val="9ABDF5"/>
+          <w:sz w:val="21"/>
+          <w:szCs w:val="21"/>
+          <w:highlight w:val="darkGreen"/>
+          <w:lang w:eastAsia="es-419"/>
+        </w:rPr>
+        <w:t xml:space="preserve"> </w:t>
+      </w:r>
+      <w:r>
+        <w:rPr>
+          <w:rFonts w:ascii="Consolas" w:eastAsia="Times New Roman" w:hAnsi="Consolas" w:cs="Times New Roman"/>
+          <w:color w:val="C0CAF5"/>
+          <w:sz w:val="21"/>
+          <w:szCs w:val="21"/>
+          <w:highlight w:val="darkGreen"/>
+          <w:lang w:eastAsia="es-419"/>
+        </w:rPr>
+        <w:t>searchParams</w:t>
+      </w:r>
+      <w:r>
+        <w:rPr>
+          <w:rFonts w:ascii="Consolas" w:eastAsia="Times New Roman" w:hAnsi="Consolas" w:cs="Times New Roman"/>
+          <w:color w:val="89DDFF"/>
+          <w:sz w:val="21"/>
+          <w:szCs w:val="21"/>
+          <w:highlight w:val="darkGreen"/>
+          <w:lang w:eastAsia="es-419"/>
+        </w:rPr>
+        <w:t>.</w:t>
+      </w:r>
+      <w:r>
+        <w:rPr>
+          <w:rFonts w:ascii="Consolas" w:eastAsia="Times New Roman" w:hAnsi="Consolas" w:cs="Times New Roman"/>
+          <w:color w:val="7AA2F7"/>
+          <w:sz w:val="21"/>
+          <w:szCs w:val="21"/>
+          <w:highlight w:val="darkGreen"/>
+          <w:lang w:eastAsia="es-419"/>
+        </w:rPr>
+        <w:t>get</w:t>
+      </w:r>
+      <w:r>
+        <w:rPr>
+          <w:rFonts w:ascii="Consolas" w:eastAsia="Times New Roman" w:hAnsi="Consolas" w:cs="Times New Roman"/>
+          <w:color w:val="9ABDF5"/>
+          <w:sz w:val="21"/>
+          <w:szCs w:val="21"/>
+          <w:highlight w:val="darkGreen"/>
+          <w:lang w:eastAsia="es-419"/>
+        </w:rPr>
+        <w:t>(</w:t>
+      </w:r>
+      <w:r>
+        <w:rPr>
+          <w:rFonts w:ascii="Consolas" w:eastAsia="Times New Roman" w:hAnsi="Consolas" w:cs="Times New Roman"/>
+          <w:color w:val="89DDFF"/>
+          <w:sz w:val="21"/>
+          <w:szCs w:val="21"/>
+          <w:highlight w:val="darkGreen"/>
+          <w:lang w:eastAsia="es-419"/>
+        </w:rPr>
+        <w:t>'</w:t>
+      </w:r>
+      <w:r>
+        <w:rPr>
+          <w:rFonts w:ascii="Consolas" w:eastAsia="Times New Roman" w:hAnsi="Consolas" w:cs="Times New Roman"/>
+          <w:color w:val="9ECE6A"/>
+          <w:sz w:val="21"/>
+          <w:szCs w:val="21"/>
+          <w:highlight w:val="darkGreen"/>
+          <w:lang w:eastAsia="es-419"/>
+        </w:rPr>
+        <w:t>section</w:t>
+      </w:r>
+      <w:r>
+        <w:rPr>
+          <w:rFonts w:ascii="Consolas" w:eastAsia="Times New Roman" w:hAnsi="Consolas" w:cs="Times New Roman"/>
+          <w:color w:val="89DDFF"/>
+          <w:sz w:val="21"/>
+          <w:szCs w:val="21"/>
+          <w:highlight w:val="darkGreen"/>
+          <w:lang w:eastAsia="es-419"/>
+        </w:rPr>
+        <w:t>'</w:t>
+      </w:r>
+      <w:r>
+        <w:rPr>
+          <w:rFonts w:ascii="Consolas" w:eastAsia="Times New Roman" w:hAnsi="Consolas" w:cs="Times New Roman"/>
+          <w:color w:val="9ABDF5"/>
+          <w:sz w:val="21"/>
+          <w:szCs w:val="21"/>
+          <w:highlight w:val="darkGreen"/>
+          <w:lang w:eastAsia="es-419"/>
+        </w:rPr>
+        <w:t>)</w:t>
+      </w:r>
+      <w:r>
+        <w:rPr>
+          <w:rFonts w:ascii="Consolas" w:eastAsia="Times New Roman" w:hAnsi="Consolas" w:cs="Times New Roman"/>
+          <w:color w:val="89DDFF"/>
+          <w:sz w:val="21"/>
+          <w:szCs w:val="21"/>
+          <w:highlight w:val="darkGreen"/>
+          <w:lang w:eastAsia="es-419"/>
+        </w:rPr>
+        <w:t>;</w:t>
+      </w:r>
+    </w:p>
+    <w:p/>
+    <w:p>
+      <w:pPr>
+        <w:rPr>
+          <w:lang w:val="es-419"/>
+        </w:rPr>
+      </w:pPr>
+      <w:r>
+        <w:rPr>
+          <w:lang w:val="es-419"/>
+        </w:rPr>
+        <w:t>Se reemplaza el useEffect por:</w:t>
+      </w:r>
+      <w:r>
+        <w:rPr>
+          <w:lang w:val="es-419"/>
+        </w:rPr>
+        <w:t xml:space="preserve"> </w:t>
+      </w:r>
+    </w:p>
+    <w:p>
+      <w:pPr>
+        <w:shd w:val="clear" w:color="auto" w:fill="24283B"/>
+        <w:spacing w:after="0" w:line="285" w:lineRule="atLeast"/>
+        <w:rPr>
+          <w:rFonts w:ascii="Consolas" w:eastAsia="Times New Roman" w:hAnsi="Consolas" w:cs="Times New Roman"/>
+          <w:color w:val="A9B1D6"/>
+          <w:sz w:val="21"/>
+          <w:szCs w:val="21"/>
+          <w:lang w:eastAsia="es-419"/>
+        </w:rPr>
+      </w:pPr>
+      <w:r>
+        <w:rPr>
+          <w:rFonts w:ascii="Consolas" w:eastAsia="Times New Roman" w:hAnsi="Consolas" w:cs="Times New Roman"/>
+          <w:color w:val="9ABDF5"/>
+          <w:sz w:val="21"/>
+          <w:szCs w:val="21"/>
+          <w:lang w:eastAsia="es-419"/>
+        </w:rPr>
+        <w:t xml:space="preserve">  </w:t>
+      </w:r>
+      <w:r>
+        <w:rPr>
+          <w:rFonts w:ascii="Consolas" w:eastAsia="Times New Roman" w:hAnsi="Consolas" w:cs="Times New Roman"/>
+          <w:color w:val="7AA2F7"/>
+          <w:sz w:val="21"/>
+          <w:szCs w:val="21"/>
+          <w:lang w:eastAsia="es-419"/>
+        </w:rPr>
+        <w:t>useEffect</w:t>
+      </w:r>
+      <w:r>
+        <w:rPr>
+          <w:rFonts w:ascii="Consolas" w:eastAsia="Times New Roman" w:hAnsi="Consolas" w:cs="Times New Roman"/>
+          <w:color w:val="9ABDF5"/>
+          <w:sz w:val="21"/>
+          <w:szCs w:val="21"/>
+          <w:lang w:eastAsia="es-419"/>
+        </w:rPr>
+        <w:t xml:space="preserve">(() </w:t>
+      </w:r>
+      <w:r>
+        <w:rPr>
+          <w:rFonts w:ascii="Consolas" w:eastAsia="Times New Roman" w:hAnsi="Consolas" w:cs="Times New Roman"/>
+          <w:color w:val="BB9AF7"/>
+          <w:sz w:val="21"/>
+          <w:szCs w:val="21"/>
+          <w:lang w:eastAsia="es-419"/>
+        </w:rPr>
+        <w:t>=&gt;</w:t>
+      </w:r>
+      <w:r>
+        <w:rPr>
+          <w:rFonts w:ascii="Consolas" w:eastAsia="Times New Roman" w:hAnsi="Consolas" w:cs="Times New Roman"/>
+          <w:color w:val="9ABDF5"/>
+          <w:sz w:val="21"/>
+          <w:szCs w:val="21"/>
+          <w:lang w:eastAsia="es-419"/>
+        </w:rPr>
+        <w:t xml:space="preserve"> {</w:t>
+      </w:r>
+    </w:p>
+    <w:p>
+      <w:pPr>
+        <w:shd w:val="clear" w:color="auto" w:fill="24283B"/>
+        <w:spacing w:after="0" w:line="285" w:lineRule="atLeast"/>
+        <w:rPr>
+          <w:rFonts w:ascii="Consolas" w:eastAsia="Times New Roman" w:hAnsi="Consolas" w:cs="Times New Roman"/>
+          <w:color w:val="A9B1D6"/>
+          <w:sz w:val="21"/>
+          <w:szCs w:val="21"/>
+          <w:lang w:eastAsia="es-419"/>
+        </w:rPr>
+      </w:pPr>
+      <w:r>
+        <w:rPr>
+          <w:rFonts w:ascii="Consolas" w:eastAsia="Times New Roman" w:hAnsi="Consolas" w:cs="Times New Roman"/>
+          <w:color w:val="9ABDF5"/>
+          <w:sz w:val="21"/>
+          <w:szCs w:val="21"/>
+          <w:lang w:eastAsia="es-419"/>
+        </w:rPr>
+        <w:t xml:space="preserve">    </w:t>
+      </w:r>
+      <w:r>
+        <w:rPr>
+          <w:rFonts w:ascii="Consolas" w:eastAsia="Times New Roman" w:hAnsi="Consolas" w:cs="Times New Roman"/>
+          <w:color w:val="BB9AF7"/>
+          <w:sz w:val="21"/>
+          <w:szCs w:val="21"/>
+          <w:lang w:eastAsia="es-419"/>
+        </w:rPr>
+        <w:t>if</w:t>
+      </w:r>
+      <w:r>
+        <w:rPr>
+          <w:rFonts w:ascii="Consolas" w:eastAsia="Times New Roman" w:hAnsi="Consolas" w:cs="Times New Roman"/>
+          <w:color w:val="9ABDF5"/>
+          <w:sz w:val="21"/>
+          <w:szCs w:val="21"/>
+          <w:lang w:eastAsia="es-419"/>
+        </w:rPr>
+        <w:t xml:space="preserve"> (</w:t>
+      </w:r>
+      <w:r>
+        <w:rPr>
+          <w:rFonts w:ascii="Consolas" w:eastAsia="Times New Roman" w:hAnsi="Consolas" w:cs="Times New Roman"/>
+          <w:color w:val="C0CAF5"/>
+          <w:sz w:val="21"/>
+          <w:szCs w:val="21"/>
+          <w:lang w:eastAsia="es-419"/>
+        </w:rPr>
+        <w:t>hasAppliedUrlFilter</w:t>
+      </w:r>
+      <w:r>
+        <w:rPr>
+          <w:rFonts w:ascii="Consolas" w:eastAsia="Times New Roman" w:hAnsi="Consolas" w:cs="Times New Roman"/>
+          <w:color w:val="89DDFF"/>
+          <w:sz w:val="21"/>
+          <w:szCs w:val="21"/>
+          <w:lang w:eastAsia="es-419"/>
+        </w:rPr>
+        <w:t>.</w:t>
+      </w:r>
+      <w:r>
+        <w:rPr>
+          <w:rFonts w:ascii="Consolas" w:eastAsia="Times New Roman" w:hAnsi="Consolas" w:cs="Times New Roman"/>
+          <w:color w:val="7DCFFF"/>
+          <w:sz w:val="21"/>
+          <w:szCs w:val="21"/>
+          <w:lang w:eastAsia="es-419"/>
+        </w:rPr>
+        <w:t>current</w:t>
+      </w:r>
+      <w:r>
+        <w:rPr>
+          <w:rFonts w:ascii="Consolas" w:eastAsia="Times New Roman" w:hAnsi="Consolas" w:cs="Times New Roman"/>
+          <w:color w:val="9ABDF5"/>
+          <w:sz w:val="21"/>
+          <w:szCs w:val="21"/>
+          <w:lang w:eastAsia="es-419"/>
+        </w:rPr>
+        <w:t xml:space="preserve">) </w:t>
+      </w:r>
+      <w:r>
+        <w:rPr>
+          <w:rFonts w:ascii="Consolas" w:eastAsia="Times New Roman" w:hAnsi="Consolas" w:cs="Times New Roman"/>
+          <w:i/>
+          <w:iCs/>
+          <w:color w:val="BB9AF7"/>
+          <w:sz w:val="21"/>
+          <w:szCs w:val="21"/>
+          <w:lang w:eastAsia="es-419"/>
+        </w:rPr>
+        <w:t>return</w:t>
+      </w:r>
+      <w:r>
+        <w:rPr>
+          <w:rFonts w:ascii="Consolas" w:eastAsia="Times New Roman" w:hAnsi="Consolas" w:cs="Times New Roman"/>
+          <w:color w:val="89DDFF"/>
+          <w:sz w:val="21"/>
+          <w:szCs w:val="21"/>
+          <w:lang w:eastAsia="es-419"/>
+        </w:rPr>
+        <w:t>;</w:t>
+      </w:r>
+    </w:p>
+    <w:p>
+      <w:pPr>
+        <w:shd w:val="clear" w:color="auto" w:fill="24283B"/>
+        <w:spacing w:after="0" w:line="285" w:lineRule="atLeast"/>
+        <w:rPr>
+          <w:rFonts w:ascii="Consolas" w:eastAsia="Times New Roman" w:hAnsi="Consolas" w:cs="Times New Roman"/>
+          <w:color w:val="A9B1D6"/>
+          <w:sz w:val="21"/>
+          <w:szCs w:val="21"/>
+          <w:lang w:eastAsia="es-419"/>
+        </w:rPr>
+      </w:pPr>
+    </w:p>
+    <w:p>
+      <w:pPr>
+        <w:shd w:val="clear" w:color="auto" w:fill="24283B"/>
+        <w:spacing w:after="0" w:line="285" w:lineRule="atLeast"/>
+        <w:rPr>
+          <w:rFonts w:ascii="Consolas" w:eastAsia="Times New Roman" w:hAnsi="Consolas" w:cs="Times New Roman"/>
+          <w:color w:val="A9B1D6"/>
+          <w:sz w:val="21"/>
+          <w:szCs w:val="21"/>
+          <w:lang w:eastAsia="es-419"/>
+        </w:rPr>
+      </w:pPr>
+      <w:r>
+        <w:rPr>
+          <w:rFonts w:ascii="Consolas" w:eastAsia="Times New Roman" w:hAnsi="Consolas" w:cs="Times New Roman"/>
+          <w:color w:val="9ABDF5"/>
+          <w:sz w:val="21"/>
+          <w:szCs w:val="21"/>
+          <w:lang w:eastAsia="es-419"/>
+        </w:rPr>
+        <w:t xml:space="preserve">    </w:t>
+      </w:r>
+      <w:r>
+        <w:rPr>
+          <w:rFonts w:ascii="Consolas" w:eastAsia="Times New Roman" w:hAnsi="Consolas" w:cs="Times New Roman"/>
+          <w:color w:val="BB9AF7"/>
+          <w:sz w:val="21"/>
+          <w:szCs w:val="21"/>
+          <w:lang w:eastAsia="es-419"/>
+        </w:rPr>
+        <w:t>if</w:t>
+      </w:r>
+      <w:r>
+        <w:rPr>
+          <w:rFonts w:ascii="Consolas" w:eastAsia="Times New Roman" w:hAnsi="Consolas" w:cs="Times New Roman"/>
+          <w:color w:val="9ABDF5"/>
+          <w:sz w:val="21"/>
+          <w:szCs w:val="21"/>
+          <w:lang w:eastAsia="es-419"/>
+        </w:rPr>
+        <w:t xml:space="preserve"> (</w:t>
+      </w:r>
+      <w:r>
+        <w:rPr>
+          <w:rFonts w:ascii="Consolas" w:eastAsia="Times New Roman" w:hAnsi="Consolas" w:cs="Times New Roman"/>
+          <w:color w:val="C0CAF5"/>
+          <w:sz w:val="21"/>
+          <w:szCs w:val="21"/>
+          <w:lang w:eastAsia="es-419"/>
+        </w:rPr>
+        <w:t>regionFromUrl</w:t>
+      </w:r>
+      <w:r>
+        <w:rPr>
+          <w:rFonts w:ascii="Consolas" w:eastAsia="Times New Roman" w:hAnsi="Consolas" w:cs="Times New Roman"/>
+          <w:color w:val="9ABDF5"/>
+          <w:sz w:val="21"/>
+          <w:szCs w:val="21"/>
+          <w:lang w:eastAsia="es-419"/>
+        </w:rPr>
+        <w:t>) {</w:t>
+      </w:r>
+    </w:p>
+    <w:p>
+      <w:pPr>
+        <w:shd w:val="clear" w:color="auto" w:fill="24283B"/>
+        <w:spacing w:after="0" w:line="285" w:lineRule="atLeast"/>
+        <w:rPr>
+          <w:rFonts w:ascii="Consolas" w:eastAsia="Times New Roman" w:hAnsi="Consolas" w:cs="Times New Roman"/>
+          <w:color w:val="A9B1D6"/>
+          <w:sz w:val="21"/>
+          <w:szCs w:val="21"/>
+          <w:lang w:eastAsia="es-419"/>
+        </w:rPr>
+      </w:pPr>
+      <w:r>
+        <w:rPr>
+          <w:rFonts w:ascii="Consolas" w:eastAsia="Times New Roman" w:hAnsi="Consolas" w:cs="Times New Roman"/>
+          <w:color w:val="9ABDF5"/>
+          <w:sz w:val="21"/>
+          <w:szCs w:val="21"/>
+          <w:lang w:eastAsia="es-419"/>
+        </w:rPr>
+        <w:t xml:space="preserve">      </w:t>
+      </w:r>
+      <w:r>
+        <w:rPr>
+          <w:rFonts w:ascii="Consolas" w:eastAsia="Times New Roman" w:hAnsi="Consolas" w:cs="Times New Roman"/>
+          <w:color w:val="7AA2F7"/>
+          <w:sz w:val="21"/>
+          <w:szCs w:val="21"/>
+          <w:lang w:eastAsia="es-419"/>
+        </w:rPr>
+        <w:t>updateFilters</w:t>
+      </w:r>
+      <w:r>
+        <w:rPr>
+          <w:rFonts w:ascii="Consolas" w:eastAsia="Times New Roman" w:hAnsi="Consolas" w:cs="Times New Roman"/>
+          <w:color w:val="9ABDF5"/>
+          <w:sz w:val="21"/>
+          <w:szCs w:val="21"/>
+          <w:lang w:eastAsia="es-419"/>
+        </w:rPr>
+        <w:t xml:space="preserve">({ </w:t>
+      </w:r>
+      <w:r>
+        <w:rPr>
+          <w:rFonts w:ascii="Consolas" w:eastAsia="Times New Roman" w:hAnsi="Consolas" w:cs="Times New Roman"/>
+          <w:color w:val="73DACA"/>
+          <w:sz w:val="21"/>
+          <w:szCs w:val="21"/>
+          <w:lang w:eastAsia="es-419"/>
+        </w:rPr>
+        <w:t>regionalFullName</w:t>
+      </w:r>
+      <w:r>
+        <w:rPr>
+          <w:rFonts w:ascii="Consolas" w:eastAsia="Times New Roman" w:hAnsi="Consolas" w:cs="Times New Roman"/>
+          <w:color w:val="89DDFF"/>
+          <w:sz w:val="21"/>
+          <w:szCs w:val="21"/>
+          <w:lang w:eastAsia="es-419"/>
+        </w:rPr>
+        <w:t>:</w:t>
+      </w:r>
+      <w:r>
+        <w:rPr>
+          <w:rFonts w:ascii="Consolas" w:eastAsia="Times New Roman" w:hAnsi="Consolas" w:cs="Times New Roman"/>
+          <w:color w:val="9ABDF5"/>
+          <w:sz w:val="21"/>
+          <w:szCs w:val="21"/>
+          <w:lang w:eastAsia="es-419"/>
+        </w:rPr>
+        <w:t xml:space="preserve"> </w:t>
+      </w:r>
+      <w:r>
+        <w:rPr>
+          <w:rFonts w:ascii="Consolas" w:eastAsia="Times New Roman" w:hAnsi="Consolas" w:cs="Times New Roman"/>
+          <w:color w:val="C0CAF5"/>
+          <w:sz w:val="21"/>
+          <w:szCs w:val="21"/>
+          <w:lang w:eastAsia="es-419"/>
+        </w:rPr>
+        <w:t>regionFromUrl</w:t>
+      </w:r>
+      <w:r>
+        <w:rPr>
+          <w:rFonts w:ascii="Consolas" w:eastAsia="Times New Roman" w:hAnsi="Consolas" w:cs="Times New Roman"/>
+          <w:color w:val="9ABDF5"/>
+          <w:sz w:val="21"/>
+          <w:szCs w:val="21"/>
+          <w:lang w:eastAsia="es-419"/>
+        </w:rPr>
+        <w:t xml:space="preserve"> })</w:t>
+      </w:r>
+      <w:r>
+        <w:rPr>
+          <w:rFonts w:ascii="Consolas" w:eastAsia="Times New Roman" w:hAnsi="Consolas" w:cs="Times New Roman"/>
+          <w:color w:val="89DDFF"/>
+          <w:sz w:val="21"/>
+          <w:szCs w:val="21"/>
+          <w:lang w:eastAsia="es-419"/>
+        </w:rPr>
+        <w:t>;</w:t>
+      </w:r>
+    </w:p>
+    <w:p>
+      <w:pPr>
+        <w:shd w:val="clear" w:color="auto" w:fill="24283B"/>
+        <w:spacing w:after="0" w:line="285" w:lineRule="atLeast"/>
+        <w:rPr>
+          <w:rFonts w:ascii="Consolas" w:eastAsia="Times New Roman" w:hAnsi="Consolas" w:cs="Times New Roman"/>
+          <w:color w:val="A9B1D6"/>
+          <w:sz w:val="21"/>
+          <w:szCs w:val="21"/>
+          <w:lang w:eastAsia="es-419"/>
+        </w:rPr>
+      </w:pPr>
+      <w:r>
+        <w:rPr>
+          <w:rFonts w:ascii="Consolas" w:eastAsia="Times New Roman" w:hAnsi="Consolas" w:cs="Times New Roman"/>
+          <w:color w:val="9ABDF5"/>
+          <w:sz w:val="21"/>
+          <w:szCs w:val="21"/>
+          <w:lang w:eastAsia="es-419"/>
+        </w:rPr>
+        <w:t>    }</w:t>
+      </w:r>
+    </w:p>
+    <w:p>
+      <w:pPr>
+        <w:shd w:val="clear" w:color="auto" w:fill="24283B"/>
+        <w:spacing w:after="0" w:line="285" w:lineRule="atLeast"/>
+        <w:rPr>
+          <w:rFonts w:ascii="Consolas" w:eastAsia="Times New Roman" w:hAnsi="Consolas" w:cs="Times New Roman"/>
+          <w:color w:val="A9B1D6"/>
+          <w:sz w:val="21"/>
+          <w:szCs w:val="21"/>
+          <w:lang w:eastAsia="es-419"/>
+        </w:rPr>
+      </w:pPr>
+    </w:p>
+    <w:p>
+      <w:pPr>
+        <w:shd w:val="clear" w:color="auto" w:fill="24283B"/>
+        <w:spacing w:after="0" w:line="285" w:lineRule="atLeast"/>
+        <w:rPr>
+          <w:rFonts w:ascii="Consolas" w:eastAsia="Times New Roman" w:hAnsi="Consolas" w:cs="Times New Roman"/>
+          <w:color w:val="A9B1D6"/>
+          <w:sz w:val="21"/>
+          <w:szCs w:val="21"/>
+          <w:lang w:eastAsia="es-419"/>
+        </w:rPr>
+      </w:pPr>
+      <w:r>
+        <w:rPr>
+          <w:rFonts w:ascii="Consolas" w:eastAsia="Times New Roman" w:hAnsi="Consolas" w:cs="Times New Roman"/>
+          <w:color w:val="9ABDF5"/>
+          <w:sz w:val="21"/>
+          <w:szCs w:val="21"/>
+          <w:lang w:eastAsia="es-419"/>
+        </w:rPr>
+        <w:t xml:space="preserve">    </w:t>
+      </w:r>
+      <w:r>
+        <w:rPr>
+          <w:rFonts w:ascii="Consolas" w:eastAsia="Times New Roman" w:hAnsi="Consolas" w:cs="Times New Roman"/>
+          <w:color w:val="BB9AF7"/>
+          <w:sz w:val="21"/>
+          <w:szCs w:val="21"/>
+          <w:lang w:eastAsia="es-419"/>
+        </w:rPr>
+        <w:t>if</w:t>
+      </w:r>
+      <w:r>
+        <w:rPr>
+          <w:rFonts w:ascii="Consolas" w:eastAsia="Times New Roman" w:hAnsi="Consolas" w:cs="Times New Roman"/>
+          <w:color w:val="9ABDF5"/>
+          <w:sz w:val="21"/>
+          <w:szCs w:val="21"/>
+          <w:lang w:eastAsia="es-419"/>
+        </w:rPr>
+        <w:t xml:space="preserve"> (</w:t>
+      </w:r>
+      <w:r>
+        <w:rPr>
+          <w:rFonts w:ascii="Consolas" w:eastAsia="Times New Roman" w:hAnsi="Consolas" w:cs="Times New Roman"/>
+          <w:color w:val="C0CAF5"/>
+          <w:sz w:val="21"/>
+          <w:szCs w:val="21"/>
+          <w:lang w:eastAsia="es-419"/>
+        </w:rPr>
+        <w:t>sectionFromUrl</w:t>
+      </w:r>
+      <w:r>
+        <w:rPr>
+          <w:rFonts w:ascii="Consolas" w:eastAsia="Times New Roman" w:hAnsi="Consolas" w:cs="Times New Roman"/>
+          <w:color w:val="9ABDF5"/>
+          <w:sz w:val="21"/>
+          <w:szCs w:val="21"/>
+          <w:lang w:eastAsia="es-419"/>
+        </w:rPr>
+        <w:t>) {</w:t>
+      </w:r>
+    </w:p>
+    <w:p>
+      <w:pPr>
+        <w:shd w:val="clear" w:color="auto" w:fill="24283B"/>
+        <w:spacing w:after="0" w:line="285" w:lineRule="atLeast"/>
+        <w:rPr>
+          <w:rFonts w:ascii="Consolas" w:eastAsia="Times New Roman" w:hAnsi="Consolas" w:cs="Times New Roman"/>
+          <w:color w:val="A9B1D6"/>
+          <w:sz w:val="21"/>
+          <w:szCs w:val="21"/>
+          <w:lang w:eastAsia="es-419"/>
+        </w:rPr>
+      </w:pPr>
+      <w:r>
+        <w:rPr>
+          <w:rFonts w:ascii="Consolas" w:eastAsia="Times New Roman" w:hAnsi="Consolas" w:cs="Times New Roman"/>
+          <w:color w:val="9ABDF5"/>
+          <w:sz w:val="21"/>
+          <w:szCs w:val="21"/>
+          <w:lang w:eastAsia="es-419"/>
+        </w:rPr>
+        <w:t xml:space="preserve">      </w:t>
+      </w:r>
+      <w:r>
+        <w:rPr>
+          <w:rFonts w:ascii="Consolas" w:eastAsia="Times New Roman" w:hAnsi="Consolas" w:cs="Times New Roman"/>
+          <w:color w:val="7AA2F7"/>
+          <w:sz w:val="21"/>
+          <w:szCs w:val="21"/>
+          <w:lang w:eastAsia="es-419"/>
+        </w:rPr>
+        <w:t>updateFilters</w:t>
+      </w:r>
+      <w:r>
+        <w:rPr>
+          <w:rFonts w:ascii="Consolas" w:eastAsia="Times New Roman" w:hAnsi="Consolas" w:cs="Times New Roman"/>
+          <w:color w:val="9ABDF5"/>
+          <w:sz w:val="21"/>
+          <w:szCs w:val="21"/>
+          <w:lang w:eastAsia="es-419"/>
+        </w:rPr>
+        <w:t xml:space="preserve">({ </w:t>
+      </w:r>
+      <w:r>
+        <w:rPr>
+          <w:rFonts w:ascii="Consolas" w:eastAsia="Times New Roman" w:hAnsi="Consolas" w:cs="Times New Roman"/>
+          <w:color w:val="73DACA"/>
+          <w:sz w:val="21"/>
+          <w:szCs w:val="21"/>
+          <w:lang w:eastAsia="es-419"/>
+        </w:rPr>
+        <w:t>name</w:t>
+      </w:r>
+      <w:r>
+        <w:rPr>
+          <w:rFonts w:ascii="Consolas" w:eastAsia="Times New Roman" w:hAnsi="Consolas" w:cs="Times New Roman"/>
+          <w:color w:val="89DDFF"/>
+          <w:sz w:val="21"/>
+          <w:szCs w:val="21"/>
+          <w:lang w:eastAsia="es-419"/>
+        </w:rPr>
+        <w:t>:</w:t>
+      </w:r>
+      <w:r>
+        <w:rPr>
+          <w:rFonts w:ascii="Consolas" w:eastAsia="Times New Roman" w:hAnsi="Consolas" w:cs="Times New Roman"/>
+          <w:color w:val="9ABDF5"/>
+          <w:sz w:val="21"/>
+          <w:szCs w:val="21"/>
+          <w:lang w:eastAsia="es-419"/>
+        </w:rPr>
+        <w:t xml:space="preserve"> </w:t>
+      </w:r>
+      <w:r>
+        <w:rPr>
+          <w:rFonts w:ascii="Consolas" w:eastAsia="Times New Roman" w:hAnsi="Consolas" w:cs="Times New Roman"/>
+          <w:color w:val="C0CAF5"/>
+          <w:sz w:val="21"/>
+          <w:szCs w:val="21"/>
+          <w:lang w:eastAsia="es-419"/>
+        </w:rPr>
+        <w:t>sectionFromUrl</w:t>
+      </w:r>
+      <w:r>
+        <w:rPr>
+          <w:rFonts w:ascii="Consolas" w:eastAsia="Times New Roman" w:hAnsi="Consolas" w:cs="Times New Roman"/>
+          <w:color w:val="9ABDF5"/>
+          <w:sz w:val="21"/>
+          <w:szCs w:val="21"/>
+          <w:lang w:eastAsia="es-419"/>
+        </w:rPr>
+        <w:t xml:space="preserve"> })</w:t>
+      </w:r>
+      <w:r>
+        <w:rPr>
+          <w:rFonts w:ascii="Consolas" w:eastAsia="Times New Roman" w:hAnsi="Consolas" w:cs="Times New Roman"/>
+          <w:color w:val="89DDFF"/>
+          <w:sz w:val="21"/>
+          <w:szCs w:val="21"/>
+          <w:lang w:eastAsia="es-419"/>
+        </w:rPr>
+        <w:t>;</w:t>
+      </w:r>
+    </w:p>
+    <w:p>
+      <w:pPr>
+        <w:shd w:val="clear" w:color="auto" w:fill="24283B"/>
+        <w:spacing w:after="0" w:line="285" w:lineRule="atLeast"/>
+        <w:rPr>
+          <w:rFonts w:ascii="Consolas" w:eastAsia="Times New Roman" w:hAnsi="Consolas" w:cs="Times New Roman"/>
+          <w:color w:val="A9B1D6"/>
+          <w:sz w:val="21"/>
+          <w:szCs w:val="21"/>
+          <w:lang w:eastAsia="es-419"/>
+        </w:rPr>
+      </w:pPr>
+      <w:r>
+        <w:rPr>
+          <w:rFonts w:ascii="Consolas" w:eastAsia="Times New Roman" w:hAnsi="Consolas" w:cs="Times New Roman"/>
+          <w:color w:val="9ABDF5"/>
+          <w:sz w:val="21"/>
+          <w:szCs w:val="21"/>
+          <w:lang w:eastAsia="es-419"/>
+        </w:rPr>
+        <w:t>    }</w:t>
+      </w:r>
+    </w:p>
+    <w:p>
+      <w:pPr>
+        <w:shd w:val="clear" w:color="auto" w:fill="24283B"/>
+        <w:spacing w:after="0" w:line="285" w:lineRule="atLeast"/>
+        <w:rPr>
+          <w:rFonts w:ascii="Consolas" w:eastAsia="Times New Roman" w:hAnsi="Consolas" w:cs="Times New Roman"/>
+          <w:color w:val="A9B1D6"/>
+          <w:sz w:val="21"/>
+          <w:szCs w:val="21"/>
+          <w:lang w:eastAsia="es-419"/>
+        </w:rPr>
+      </w:pPr>
+    </w:p>
+    <w:p>
+      <w:pPr>
+        <w:shd w:val="clear" w:color="auto" w:fill="24283B"/>
+        <w:spacing w:after="0" w:line="285" w:lineRule="atLeast"/>
+        <w:rPr>
+          <w:rFonts w:ascii="Consolas" w:eastAsia="Times New Roman" w:hAnsi="Consolas" w:cs="Times New Roman"/>
+          <w:color w:val="A9B1D6"/>
+          <w:sz w:val="21"/>
+          <w:szCs w:val="21"/>
+          <w:lang w:eastAsia="es-419"/>
+        </w:rPr>
+      </w:pPr>
+      <w:r>
+        <w:rPr>
+          <w:rFonts w:ascii="Consolas" w:eastAsia="Times New Roman" w:hAnsi="Consolas" w:cs="Times New Roman"/>
+          <w:color w:val="9ABDF5"/>
+          <w:sz w:val="21"/>
+          <w:szCs w:val="21"/>
+          <w:lang w:eastAsia="es-419"/>
+        </w:rPr>
+        <w:t xml:space="preserve">    </w:t>
+      </w:r>
+      <w:r>
+        <w:rPr>
+          <w:rFonts w:ascii="Consolas" w:eastAsia="Times New Roman" w:hAnsi="Consolas" w:cs="Times New Roman"/>
+          <w:color w:val="BB9AF7"/>
+          <w:sz w:val="21"/>
+          <w:szCs w:val="21"/>
+          <w:lang w:eastAsia="es-419"/>
+        </w:rPr>
+        <w:t>if</w:t>
+      </w:r>
+      <w:r>
+        <w:rPr>
+          <w:rFonts w:ascii="Consolas" w:eastAsia="Times New Roman" w:hAnsi="Consolas" w:cs="Times New Roman"/>
+          <w:color w:val="9ABDF5"/>
+          <w:sz w:val="21"/>
+          <w:szCs w:val="21"/>
+          <w:lang w:eastAsia="es-419"/>
+        </w:rPr>
+        <w:t xml:space="preserve"> (</w:t>
+      </w:r>
+      <w:r>
+        <w:rPr>
+          <w:rFonts w:ascii="Consolas" w:eastAsia="Times New Roman" w:hAnsi="Consolas" w:cs="Times New Roman"/>
+          <w:color w:val="C0CAF5"/>
+          <w:sz w:val="21"/>
+          <w:szCs w:val="21"/>
+          <w:lang w:eastAsia="es-419"/>
+        </w:rPr>
+        <w:t>regionFromUrl</w:t>
+      </w:r>
+      <w:r>
+        <w:rPr>
+          <w:rFonts w:ascii="Consolas" w:eastAsia="Times New Roman" w:hAnsi="Consolas" w:cs="Times New Roman"/>
+          <w:color w:val="9ABDF5"/>
+          <w:sz w:val="21"/>
+          <w:szCs w:val="21"/>
+          <w:lang w:eastAsia="es-419"/>
+        </w:rPr>
+        <w:t xml:space="preserve"> </w:t>
+      </w:r>
+      <w:r>
+        <w:rPr>
+          <w:rFonts w:ascii="Consolas" w:eastAsia="Times New Roman" w:hAnsi="Consolas" w:cs="Times New Roman"/>
+          <w:color w:val="BB9AF7"/>
+          <w:sz w:val="21"/>
+          <w:szCs w:val="21"/>
+          <w:lang w:eastAsia="es-419"/>
+        </w:rPr>
+        <w:t>||</w:t>
+      </w:r>
+      <w:r>
+        <w:rPr>
+          <w:rFonts w:ascii="Consolas" w:eastAsia="Times New Roman" w:hAnsi="Consolas" w:cs="Times New Roman"/>
+          <w:color w:val="9ABDF5"/>
+          <w:sz w:val="21"/>
+          <w:szCs w:val="21"/>
+          <w:lang w:eastAsia="es-419"/>
+        </w:rPr>
+        <w:t xml:space="preserve"> </w:t>
+      </w:r>
+      <w:r>
+        <w:rPr>
+          <w:rFonts w:ascii="Consolas" w:eastAsia="Times New Roman" w:hAnsi="Consolas" w:cs="Times New Roman"/>
+          <w:color w:val="C0CAF5"/>
+          <w:sz w:val="21"/>
+          <w:szCs w:val="21"/>
+          <w:lang w:eastAsia="es-419"/>
+        </w:rPr>
+        <w:t>sectionFromUrl</w:t>
+      </w:r>
+      <w:r>
+        <w:rPr>
+          <w:rFonts w:ascii="Consolas" w:eastAsia="Times New Roman" w:hAnsi="Consolas" w:cs="Times New Roman"/>
+          <w:color w:val="9ABDF5"/>
+          <w:sz w:val="21"/>
+          <w:szCs w:val="21"/>
+          <w:lang w:eastAsia="es-419"/>
+        </w:rPr>
+        <w:t>) {</w:t>
+      </w:r>
+    </w:p>
+    <w:p>
+      <w:pPr>
+        <w:shd w:val="clear" w:color="auto" w:fill="24283B"/>
+        <w:spacing w:after="0" w:line="285" w:lineRule="atLeast"/>
+        <w:rPr>
+          <w:rFonts w:ascii="Consolas" w:eastAsia="Times New Roman" w:hAnsi="Consolas" w:cs="Times New Roman"/>
+          <w:color w:val="A9B1D6"/>
+          <w:sz w:val="21"/>
+          <w:szCs w:val="21"/>
+          <w:lang w:eastAsia="es-419"/>
+        </w:rPr>
+      </w:pPr>
+      <w:r>
+        <w:rPr>
+          <w:rFonts w:ascii="Consolas" w:eastAsia="Times New Roman" w:hAnsi="Consolas" w:cs="Times New Roman"/>
+          <w:color w:val="9ABDF5"/>
+          <w:sz w:val="21"/>
+          <w:szCs w:val="21"/>
+          <w:lang w:eastAsia="es-419"/>
+        </w:rPr>
+        <w:t xml:space="preserve">      </w:t>
+      </w:r>
+      <w:r>
+        <w:rPr>
+          <w:rFonts w:ascii="Consolas" w:eastAsia="Times New Roman" w:hAnsi="Consolas" w:cs="Times New Roman"/>
+          <w:color w:val="C0CAF5"/>
+          <w:sz w:val="21"/>
+          <w:szCs w:val="21"/>
+          <w:lang w:eastAsia="es-419"/>
+        </w:rPr>
+        <w:t>table</w:t>
+      </w:r>
+      <w:r>
+        <w:rPr>
+          <w:rFonts w:ascii="Consolas" w:eastAsia="Times New Roman" w:hAnsi="Consolas" w:cs="Times New Roman"/>
+          <w:color w:val="89DDFF"/>
+          <w:sz w:val="21"/>
+          <w:szCs w:val="21"/>
+          <w:lang w:eastAsia="es-419"/>
+        </w:rPr>
+        <w:t>.</w:t>
+      </w:r>
+      <w:r>
+        <w:rPr>
+          <w:rFonts w:ascii="Consolas" w:eastAsia="Times New Roman" w:hAnsi="Consolas" w:cs="Times New Roman"/>
+          <w:color w:val="7AA2F7"/>
+          <w:sz w:val="21"/>
+          <w:szCs w:val="21"/>
+          <w:lang w:eastAsia="es-419"/>
+        </w:rPr>
+        <w:t>onResetPage</w:t>
+      </w:r>
+      <w:r>
+        <w:rPr>
+          <w:rFonts w:ascii="Consolas" w:eastAsia="Times New Roman" w:hAnsi="Consolas" w:cs="Times New Roman"/>
+          <w:color w:val="9ABDF5"/>
+          <w:sz w:val="21"/>
+          <w:szCs w:val="21"/>
+          <w:lang w:eastAsia="es-419"/>
+        </w:rPr>
+        <w:t>()</w:t>
+      </w:r>
+      <w:r>
+        <w:rPr>
+          <w:rFonts w:ascii="Consolas" w:eastAsia="Times New Roman" w:hAnsi="Consolas" w:cs="Times New Roman"/>
+          <w:color w:val="89DDFF"/>
+          <w:sz w:val="21"/>
+          <w:szCs w:val="21"/>
+          <w:lang w:eastAsia="es-419"/>
+        </w:rPr>
+        <w:t>;</w:t>
+      </w:r>
+    </w:p>
+    <w:p>
+      <w:pPr>
+        <w:shd w:val="clear" w:color="auto" w:fill="24283B"/>
+        <w:spacing w:after="0" w:line="285" w:lineRule="atLeast"/>
+        <w:rPr>
+          <w:rFonts w:ascii="Consolas" w:eastAsia="Times New Roman" w:hAnsi="Consolas" w:cs="Times New Roman"/>
+          <w:color w:val="A9B1D6"/>
+          <w:sz w:val="21"/>
+          <w:szCs w:val="21"/>
+          <w:lang w:eastAsia="es-419"/>
+        </w:rPr>
+      </w:pPr>
+      <w:r>
+        <w:rPr>
+          <w:rFonts w:ascii="Consolas" w:eastAsia="Times New Roman" w:hAnsi="Consolas" w:cs="Times New Roman"/>
+          <w:color w:val="9ABDF5"/>
+          <w:sz w:val="21"/>
+          <w:szCs w:val="21"/>
+          <w:lang w:eastAsia="es-419"/>
+        </w:rPr>
+        <w:t xml:space="preserve">      </w:t>
+      </w:r>
+      <w:r>
+        <w:rPr>
+          <w:rFonts w:ascii="Consolas" w:eastAsia="Times New Roman" w:hAnsi="Consolas" w:cs="Times New Roman"/>
+          <w:color w:val="C0CAF5"/>
+          <w:sz w:val="21"/>
+          <w:szCs w:val="21"/>
+          <w:lang w:eastAsia="es-419"/>
+        </w:rPr>
+        <w:t>hasAppliedUrlFilter</w:t>
+      </w:r>
+      <w:r>
+        <w:rPr>
+          <w:rFonts w:ascii="Consolas" w:eastAsia="Times New Roman" w:hAnsi="Consolas" w:cs="Times New Roman"/>
+          <w:color w:val="89DDFF"/>
+          <w:sz w:val="21"/>
+          <w:szCs w:val="21"/>
+          <w:lang w:eastAsia="es-419"/>
+        </w:rPr>
+        <w:t>.</w:t>
+      </w:r>
+      <w:r>
+        <w:rPr>
+          <w:rFonts w:ascii="Consolas" w:eastAsia="Times New Roman" w:hAnsi="Consolas" w:cs="Times New Roman"/>
+          <w:color w:val="7DCFFF"/>
+          <w:sz w:val="21"/>
+          <w:szCs w:val="21"/>
+          <w:lang w:eastAsia="es-419"/>
+        </w:rPr>
+        <w:t>current</w:t>
+      </w:r>
+      <w:r>
+        <w:rPr>
+          <w:rFonts w:ascii="Consolas" w:eastAsia="Times New Roman" w:hAnsi="Consolas" w:cs="Times New Roman"/>
+          <w:color w:val="9ABDF5"/>
+          <w:sz w:val="21"/>
+          <w:szCs w:val="21"/>
+          <w:lang w:eastAsia="es-419"/>
+        </w:rPr>
+        <w:t xml:space="preserve"> </w:t>
+      </w:r>
+      <w:r>
+        <w:rPr>
+          <w:rFonts w:ascii="Consolas" w:eastAsia="Times New Roman" w:hAnsi="Consolas" w:cs="Times New Roman"/>
+          <w:color w:val="89DDFF"/>
+          <w:sz w:val="21"/>
+          <w:szCs w:val="21"/>
+          <w:lang w:eastAsia="es-419"/>
+        </w:rPr>
+        <w:t>=</w:t>
+      </w:r>
+      <w:r>
+        <w:rPr>
+          <w:rFonts w:ascii="Consolas" w:eastAsia="Times New Roman" w:hAnsi="Consolas" w:cs="Times New Roman"/>
+          <w:color w:val="9ABDF5"/>
+          <w:sz w:val="21"/>
+          <w:szCs w:val="21"/>
+          <w:lang w:eastAsia="es-419"/>
+        </w:rPr>
+        <w:t xml:space="preserve"> </w:t>
+      </w:r>
+      <w:r>
+        <w:rPr>
+          <w:rFonts w:ascii="Consolas" w:eastAsia="Times New Roman" w:hAnsi="Consolas" w:cs="Times New Roman"/>
+          <w:color w:val="FF9E64"/>
+          <w:sz w:val="21"/>
+          <w:szCs w:val="21"/>
+          <w:lang w:eastAsia="es-419"/>
+        </w:rPr>
+        <w:t>true</w:t>
+      </w:r>
+      <w:r>
+        <w:rPr>
+          <w:rFonts w:ascii="Consolas" w:eastAsia="Times New Roman" w:hAnsi="Consolas" w:cs="Times New Roman"/>
+          <w:color w:val="89DDFF"/>
+          <w:sz w:val="21"/>
+          <w:szCs w:val="21"/>
+          <w:lang w:eastAsia="es-419"/>
+        </w:rPr>
+        <w:t>;</w:t>
+      </w:r>
+    </w:p>
+    <w:p>
+      <w:pPr>
+        <w:shd w:val="clear" w:color="auto" w:fill="24283B"/>
+        <w:spacing w:after="0" w:line="285" w:lineRule="atLeast"/>
+        <w:rPr>
+          <w:rFonts w:ascii="Consolas" w:eastAsia="Times New Roman" w:hAnsi="Consolas" w:cs="Times New Roman"/>
+          <w:color w:val="A9B1D6"/>
+          <w:sz w:val="21"/>
+          <w:szCs w:val="21"/>
+          <w:lang w:eastAsia="es-419"/>
+        </w:rPr>
+      </w:pPr>
+      <w:r>
+        <w:rPr>
+          <w:rFonts w:ascii="Consolas" w:eastAsia="Times New Roman" w:hAnsi="Consolas" w:cs="Times New Roman"/>
+          <w:color w:val="9ABDF5"/>
+          <w:sz w:val="21"/>
+          <w:szCs w:val="21"/>
+          <w:lang w:eastAsia="es-419"/>
+        </w:rPr>
+        <w:t>    }</w:t>
+      </w:r>
+    </w:p>
+    <w:p>
+      <w:pPr>
+        <w:shd w:val="clear" w:color="auto" w:fill="24283B"/>
+        <w:spacing w:after="0" w:line="285" w:lineRule="atLeast"/>
+        <w:rPr>
+          <w:rFonts w:ascii="Consolas" w:eastAsia="Times New Roman" w:hAnsi="Consolas" w:cs="Times New Roman"/>
+          <w:color w:val="A9B1D6"/>
+          <w:sz w:val="21"/>
+          <w:szCs w:val="21"/>
+          <w:lang w:eastAsia="es-419"/>
+        </w:rPr>
+      </w:pPr>
+      <w:r>
+        <w:rPr>
+          <w:rFonts w:ascii="Consolas" w:eastAsia="Times New Roman" w:hAnsi="Consolas" w:cs="Times New Roman"/>
+          <w:color w:val="9ABDF5"/>
+          <w:sz w:val="21"/>
+          <w:szCs w:val="21"/>
+          <w:lang w:eastAsia="es-419"/>
+        </w:rPr>
+        <w:t>  }</w:t>
+      </w:r>
+      <w:r>
+        <w:rPr>
+          <w:rFonts w:ascii="Consolas" w:eastAsia="Times New Roman" w:hAnsi="Consolas" w:cs="Times New Roman"/>
+          <w:color w:val="89DDFF"/>
+          <w:sz w:val="21"/>
+          <w:szCs w:val="21"/>
+          <w:lang w:eastAsia="es-419"/>
+        </w:rPr>
+        <w:t>,</w:t>
+      </w:r>
+      <w:r>
+        <w:rPr>
+          <w:rFonts w:ascii="Consolas" w:eastAsia="Times New Roman" w:hAnsi="Consolas" w:cs="Times New Roman"/>
+          <w:color w:val="9ABDF5"/>
+          <w:sz w:val="21"/>
+          <w:szCs w:val="21"/>
+          <w:lang w:eastAsia="es-419"/>
+        </w:rPr>
+        <w:t xml:space="preserve"> [</w:t>
+      </w:r>
+      <w:r>
+        <w:rPr>
+          <w:rFonts w:ascii="Consolas" w:eastAsia="Times New Roman" w:hAnsi="Consolas" w:cs="Times New Roman"/>
+          <w:color w:val="7DCFFF"/>
+          <w:sz w:val="21"/>
+          <w:szCs w:val="21"/>
+          <w:lang w:eastAsia="es-419"/>
+        </w:rPr>
+        <w:t>regionFromUrl</w:t>
+      </w:r>
+      <w:r>
+        <w:rPr>
+          <w:rFonts w:ascii="Consolas" w:eastAsia="Times New Roman" w:hAnsi="Consolas" w:cs="Times New Roman"/>
+          <w:color w:val="89DDFF"/>
+          <w:sz w:val="21"/>
+          <w:szCs w:val="21"/>
+          <w:lang w:eastAsia="es-419"/>
+        </w:rPr>
+        <w:t>,</w:t>
+      </w:r>
+      <w:r>
+        <w:rPr>
+          <w:rFonts w:ascii="Consolas" w:eastAsia="Times New Roman" w:hAnsi="Consolas" w:cs="Times New Roman"/>
+          <w:color w:val="9ABDF5"/>
+          <w:sz w:val="21"/>
+          <w:szCs w:val="21"/>
+          <w:lang w:eastAsia="es-419"/>
+        </w:rPr>
+        <w:t xml:space="preserve"> </w:t>
+      </w:r>
+      <w:r>
+        <w:rPr>
+          <w:rFonts w:ascii="Consolas" w:eastAsia="Times New Roman" w:hAnsi="Consolas" w:cs="Times New Roman"/>
+          <w:color w:val="7DCFFF"/>
+          <w:sz w:val="21"/>
+          <w:szCs w:val="21"/>
+          <w:lang w:eastAsia="es-419"/>
+        </w:rPr>
+        <w:t>sectionFromUrl</w:t>
+      </w:r>
+      <w:r>
+        <w:rPr>
+          <w:rFonts w:ascii="Consolas" w:eastAsia="Times New Roman" w:hAnsi="Consolas" w:cs="Times New Roman"/>
+          <w:color w:val="89DDFF"/>
+          <w:sz w:val="21"/>
+          <w:szCs w:val="21"/>
+          <w:lang w:eastAsia="es-419"/>
+        </w:rPr>
+        <w:t>,</w:t>
+      </w:r>
+      <w:r>
+        <w:rPr>
+          <w:rFonts w:ascii="Consolas" w:eastAsia="Times New Roman" w:hAnsi="Consolas" w:cs="Times New Roman"/>
+          <w:color w:val="9ABDF5"/>
+          <w:sz w:val="21"/>
+          <w:szCs w:val="21"/>
+          <w:lang w:eastAsia="es-419"/>
+        </w:rPr>
+        <w:t xml:space="preserve"> </w:t>
+      </w:r>
+      <w:r>
+        <w:rPr>
+          <w:rFonts w:ascii="Consolas" w:eastAsia="Times New Roman" w:hAnsi="Consolas" w:cs="Times New Roman"/>
+          <w:color w:val="7DCFFF"/>
+          <w:sz w:val="21"/>
+          <w:szCs w:val="21"/>
+          <w:lang w:eastAsia="es-419"/>
+        </w:rPr>
+        <w:t>updateFilters</w:t>
+      </w:r>
+      <w:r>
+        <w:rPr>
+          <w:rFonts w:ascii="Consolas" w:eastAsia="Times New Roman" w:hAnsi="Consolas" w:cs="Times New Roman"/>
+          <w:color w:val="89DDFF"/>
+          <w:sz w:val="21"/>
+          <w:szCs w:val="21"/>
+          <w:lang w:eastAsia="es-419"/>
+        </w:rPr>
+        <w:t>,</w:t>
+      </w:r>
+      <w:r>
+        <w:rPr>
+          <w:rFonts w:ascii="Consolas" w:eastAsia="Times New Roman" w:hAnsi="Consolas" w:cs="Times New Roman"/>
+          <w:color w:val="9ABDF5"/>
+          <w:sz w:val="21"/>
+          <w:szCs w:val="21"/>
+          <w:lang w:eastAsia="es-419"/>
+        </w:rPr>
+        <w:t xml:space="preserve"> </w:t>
+      </w:r>
+      <w:r>
+        <w:rPr>
+          <w:rFonts w:ascii="Consolas" w:eastAsia="Times New Roman" w:hAnsi="Consolas" w:cs="Times New Roman"/>
+          <w:color w:val="7DCFFF"/>
+          <w:sz w:val="21"/>
+          <w:szCs w:val="21"/>
+          <w:lang w:eastAsia="es-419"/>
+        </w:rPr>
+        <w:t>table</w:t>
+      </w:r>
+      <w:r>
+        <w:rPr>
+          <w:rFonts w:ascii="Consolas" w:eastAsia="Times New Roman" w:hAnsi="Consolas" w:cs="Times New Roman"/>
+          <w:color w:val="9ABDF5"/>
+          <w:sz w:val="21"/>
+          <w:szCs w:val="21"/>
+          <w:lang w:eastAsia="es-419"/>
+        </w:rPr>
+        <w:t>])</w:t>
+      </w:r>
+      <w:r>
+        <w:rPr>
+          <w:rFonts w:ascii="Consolas" w:eastAsia="Times New Roman" w:hAnsi="Consolas" w:cs="Times New Roman"/>
+          <w:color w:val="89DDFF"/>
+          <w:sz w:val="21"/>
+          <w:szCs w:val="21"/>
+          <w:lang w:eastAsia="es-419"/>
+        </w:rPr>
+        <w:t>;</w:t>
+      </w:r>
+    </w:p>
+    <w:p>
+      <w:pPr>
+        <w:shd w:val="clear" w:color="auto" w:fill="24283B"/>
+        <w:spacing w:after="240" w:line="285" w:lineRule="atLeast"/>
+        <w:rPr>
+          <w:rFonts w:ascii="Consolas" w:eastAsia="Times New Roman" w:hAnsi="Consolas" w:cs="Times New Roman"/>
+          <w:color w:val="A9B1D6"/>
+          <w:sz w:val="21"/>
+          <w:szCs w:val="21"/>
+          <w:lang w:eastAsia="es-419"/>
+        </w:rPr>
+      </w:pPr>
+    </w:p>
+    <w:p/>
     <w:sectPr>
       <w:pgSz w:w="12240" w:h="15840"/>
       <w:pgMar w:top="1440" w:right="1800" w:bottom="1440" w:left="1800" w:header="720" w:footer="720" w:gutter="0"/>
@@ -15277,6 +17712,97 @@
       </w:tcPr>
     </w:tblStylePr>
   </w:style>
+  <w:style w:type="character" w:customStyle="1" w:styleId="nextjscontainererrorslabel">
+    <w:name w:val="nextjs__container_errors_label"/>
+    <w:basedOn w:val="DefaultParagraphFont"/>
+    <w:rsid w:val="006B3C3A"/>
+  </w:style>
+  <w:style w:type="paragraph" w:customStyle="1" w:styleId="code-frame-link">
+    <w:name w:val="code-frame-link"/>
+    <w:basedOn w:val="Normal"/>
+    <w:rsid w:val="006B3C3A"/>
+    <w:pPr>
+      <w:spacing w:before="100" w:beforeAutospacing="1" w:after="100" w:afterAutospacing="1" w:line="240" w:lineRule="auto"/>
+    </w:pPr>
+    <w:rPr>
+      <w:rFonts w:ascii="Times New Roman" w:eastAsia="Times New Roman" w:hAnsi="Times New Roman" w:cs="Times New Roman"/>
+      <w:sz w:val="24"/>
+      <w:szCs w:val="24"/>
+      <w:lang w:val="es-419" w:eastAsia="es-419"/>
+    </w:rPr>
+  </w:style>
+  <w:style w:type="paragraph" w:styleId="HTMLPreformatted">
+    <w:name w:val="HTML Preformatted"/>
+    <w:basedOn w:val="Normal"/>
+    <w:link w:val="HTMLPreformattedChar"/>
+    <w:uiPriority w:val="99"/>
+    <w:semiHidden/>
+    <w:unhideWhenUsed/>
+    <w:rsid w:val="006B3C3A"/>
+    <w:pPr>
+      <w:tabs>
+        <w:tab w:val="left" w:pos="916"/>
+        <w:tab w:val="left" w:pos="1832"/>
+        <w:tab w:val="left" w:pos="2748"/>
+        <w:tab w:val="left" w:pos="3664"/>
+        <w:tab w:val="left" w:pos="4580"/>
+        <w:tab w:val="left" w:pos="5496"/>
+        <w:tab w:val="left" w:pos="6412"/>
+        <w:tab w:val="left" w:pos="7328"/>
+        <w:tab w:val="left" w:pos="8244"/>
+        <w:tab w:val="left" w:pos="9160"/>
+        <w:tab w:val="left" w:pos="10076"/>
+        <w:tab w:val="left" w:pos="10992"/>
+        <w:tab w:val="left" w:pos="11908"/>
+        <w:tab w:val="left" w:pos="12824"/>
+        <w:tab w:val="left" w:pos="13740"/>
+        <w:tab w:val="left" w:pos="14656"/>
+      </w:tabs>
+      <w:spacing w:after="0" w:line="240" w:lineRule="auto"/>
+    </w:pPr>
+    <w:rPr>
+      <w:rFonts w:ascii="Courier New" w:eastAsia="Times New Roman" w:hAnsi="Courier New" w:cs="Courier New"/>
+      <w:sz w:val="20"/>
+      <w:szCs w:val="20"/>
+      <w:lang w:val="es-419" w:eastAsia="es-419"/>
+    </w:rPr>
+  </w:style>
+  <w:style w:type="character" w:customStyle="1" w:styleId="HTMLPreformattedChar">
+    <w:name w:val="HTML Preformatted Char"/>
+    <w:basedOn w:val="DefaultParagraphFont"/>
+    <w:link w:val="HTMLPreformatted"/>
+    <w:uiPriority w:val="99"/>
+    <w:semiHidden/>
+    <w:rsid w:val="006B3C3A"/>
+    <w:rPr>
+      <w:rFonts w:ascii="Courier New" w:eastAsia="Times New Roman" w:hAnsi="Courier New" w:cs="Courier New"/>
+      <w:sz w:val="20"/>
+      <w:szCs w:val="20"/>
+      <w:lang w:val="es-419" w:eastAsia="es-419"/>
+    </w:rPr>
+  </w:style>
+  <w:style w:type="paragraph" w:styleId="NormalWeb">
+    <w:name w:val="Normal (Web)"/>
+    <w:basedOn w:val="Normal"/>
+    <w:uiPriority w:val="99"/>
+    <w:semiHidden/>
+    <w:unhideWhenUsed/>
+    <w:rsid w:val="006B3C3A"/>
+    <w:pPr>
+      <w:spacing w:before="100" w:beforeAutospacing="1" w:after="100" w:afterAutospacing="1" w:line="240" w:lineRule="auto"/>
+    </w:pPr>
+    <w:rPr>
+      <w:rFonts w:ascii="Times New Roman" w:eastAsia="Times New Roman" w:hAnsi="Times New Roman" w:cs="Times New Roman"/>
+      <w:sz w:val="24"/>
+      <w:szCs w:val="24"/>
+      <w:lang w:val="es-419" w:eastAsia="es-419"/>
+    </w:rPr>
+  </w:style>
+  <w:style w:type="character" w:customStyle="1" w:styleId="call-stack-frame-file-source">
+    <w:name w:val="call-stack-frame-file-source"/>
+    <w:basedOn w:val="DefaultParagraphFont"/>
+    <w:rsid w:val="006B3C3A"/>
+  </w:style>
 </w:styles>
 </file>
 

</xml_diff>